<commit_message>
updated expect_after_motion_or_answer_content.docx with Links in this step and bitlys
</commit_message>
<xml_diff>
--- a/docassemble/AKA2JBranding/data/templates/expect_after_motion_or_answer_content.docx
+++ b/docassemble/AKA2JBranding/data/templates/expect_after_motion_or_answer_content.docx
@@ -5,9 +5,6 @@
     <w:p>
       <w:pPr>
         <w:pStyle w:val="Body"/>
-        <w:rPr>
-          <w:color w:val="FF0000"/>
-        </w:rPr>
       </w:pPr>
       <w:r>
         <w:rPr>
@@ -46,9 +43,9 @@
         <w:spacing w:before="54"/>
       </w:pPr>
       <w:r>
-        <w:t>Jurisdiction can be very complicated.  can help you decide the best state for your case.</w:t>
-      </w:r>
-      <w:hyperlink r:id="rId6" w:history="1">
+        <w:t xml:space="preserve">Jurisdiction can be very complicated. </w:t>
+      </w:r>
+      <w:hyperlink r:id="rId8" w:history="1">
         <w:r>
           <w:rPr>
             <w:rStyle w:val="Hyperlink"/>
@@ -56,6 +53,9 @@
           <w:t>Talking to a lawyer</w:t>
         </w:r>
       </w:hyperlink>
+      <w:r>
+        <w:t xml:space="preserve"> can help you decide the best state for your case.</w:t>
+      </w:r>
     </w:p>
     <w:p>
       <w:pPr>
@@ -65,7 +65,7 @@
         <w:rPr>
           <w:color w:val="FF0000"/>
         </w:rPr>
-        <w:t xml:space="preserve"> {%p elif (user_need == 'answer custody' and type_of_response.all_true('ak custody case', exclusive = True)) or (user_need == 'answer divorce' and type_of_response.all_true('ak divorce case', exclusive = True)) or (type_of_response['case in 2 states'] and not type_of_response['default'] and stage_of_other_case == 'ended with no order') %}</w:t>
+        <w:t>{%p elif (user_need == 'answer custody' and type_of_response.all_true('ak custody case', exclusive = True)) or (user_need == 'answer divorce' and type_of_response.all_true('ak divorce case', exclusive = True)) or (type_of_response['case in 2 states'] and not type_of_response['default'] and stage_of_other_case == 'ended with no order') %}</w:t>
       </w:r>
     </w:p>
     <w:p>
@@ -82,7 +82,58 @@
         <w:spacing w:before="54"/>
       </w:pPr>
       <w:r>
-        <w:t>They will send you a notice with the date and time of the hearing.{% if user_need == 'answer divorce' %}: Within 45 days of filing your answer, both of you are supposed to tell each other about all your property and debt. Fill out and give your spouse:</w:t>
+        <w:t>They will send you a notice with the date and time of the hearing.</w:t>
+      </w:r>
+    </w:p>
+    <w:p>
+      <w:pPr>
+        <w:pStyle w:val="Body"/>
+        <w:spacing w:before="54"/>
+      </w:pPr>
+      <w:r>
+        <w:rPr>
+          <w:color w:val="FFC000"/>
+        </w:rPr>
+        <w:t>{%</w:t>
+      </w:r>
+      <w:r>
+        <w:rPr>
+          <w:color w:val="FFC000"/>
+        </w:rPr>
+        <w:t>p</w:t>
+      </w:r>
+      <w:r>
+        <w:rPr>
+          <w:color w:val="FFC000"/>
+        </w:rPr>
+        <w:t xml:space="preserve"> if user_need == 'answer divorce' </w:t>
+      </w:r>
+      <w:r>
+        <w:rPr>
+          <w:color w:val="FFC000"/>
+        </w:rPr>
+        <w:t>and not (type_of_response['case in 2 states'] and stage_of_other_case in ('still going', 'ended with order'))</w:t>
+      </w:r>
+      <w:r>
+        <w:rPr>
+          <w:color w:val="FFC000"/>
+        </w:rPr>
+        <w:t xml:space="preserve"> </w:t>
+      </w:r>
+      <w:r>
+        <w:rPr>
+          <w:color w:val="FFC000"/>
+        </w:rPr>
+        <w:t>%}</w:t>
+      </w:r>
+    </w:p>
+    <w:p>
+      <w:pPr>
+        <w:pStyle w:val="Body"/>
+        <w:spacing w:before="54"/>
+      </w:pPr>
+      <w:r>
+        <w:t>Within 45 days of filing your answer, both of you are supposed to tell each other about all your property and debt. Fill out and give your spouse:</w:t>
       </w:r>
     </w:p>
     <w:p>
@@ -100,9 +151,9 @@
           <w:b/>
           <w:bCs/>
         </w:rPr>
-        <w:t xml:space="preserve">Civil Rule 26.1 Questionnaire, SHC-1010  | </w:t>
-      </w:r>
-      <w:hyperlink r:id="rId7" w:history="1">
+        <w:t xml:space="preserve">Civil Rule 26.1 Questionnaire, SHC-1010 </w:t>
+      </w:r>
+      <w:hyperlink r:id="rId9" w:history="1">
         <w:r>
           <w:rPr>
             <w:rStyle w:val="Hyperlink"/>
@@ -110,7 +161,14 @@
           <w:t>Word</w:t>
         </w:r>
       </w:hyperlink>
-      <w:hyperlink r:id="rId8" w:history="1">
+      <w:r>
+        <w:rPr>
+          <w:b/>
+          <w:bCs/>
+        </w:rPr>
+        <w:t xml:space="preserve"> | </w:t>
+      </w:r>
+      <w:hyperlink r:id="rId10" w:history="1">
         <w:r>
           <w:rPr>
             <w:rStyle w:val="Hyperlink"/>
@@ -134,11 +192,9 @@
           <w:b/>
           <w:bCs/>
         </w:rPr>
-        <w:t xml:space="preserve">Property &amp; Debt Worksheet, SHC-1000 SHC-1000  |   </w:t>
-      </w:r>
-      <w:proofErr w:type="spellStart"/>
-      <w:proofErr w:type="spellEnd"/>
-      <w:hyperlink r:id="rId9" w:history="1">
+        <w:t xml:space="preserve">Property &amp; Debt Worksheet, SHC-1000 SHC-1000 </w:t>
+      </w:r>
+      <w:hyperlink r:id="rId11" w:history="1">
         <w:r>
           <w:rPr>
             <w:rStyle w:val="Hyperlink"/>
@@ -146,7 +202,14 @@
           <w:t>Word</w:t>
         </w:r>
       </w:hyperlink>
-      <w:hyperlink r:id="rId10" w:history="1">
+      <w:r>
+        <w:rPr>
+          <w:b/>
+          <w:bCs/>
+        </w:rPr>
+        <w:t xml:space="preserve"> | </w:t>
+      </w:r>
+      <w:hyperlink r:id="rId12" w:history="1">
         <w:r>
           <w:rPr>
             <w:rStyle w:val="Hyperlink"/>
@@ -163,9 +226,9 @@
         </w:rPr>
       </w:pPr>
       <w:r>
-        <w:t xml:space="preserve">Read </w:t>
-      </w:r>
-      <w:hyperlink r:id="rId11" w:history="1">
+        <w:t xml:space="preserve">See the court's web page </w:t>
+      </w:r>
+      <w:hyperlink r:id="rId13" w:history="1">
         <w:r>
           <w:rPr>
             <w:rStyle w:val="Hyperlink"/>
@@ -214,15 +277,18 @@
       <w:pPr>
         <w:pStyle w:val="Body"/>
         <w:spacing w:before="54"/>
+        <w:rPr>
+          <w:rStyle w:val="Hyperlink"/>
+        </w:rPr>
       </w:pPr>
       <w:r>
         <w:rPr>
           <w:rStyle w:val="Hyperlink"/>
           <w:color w:val="202529"/>
         </w:rPr>
-        <w:t>Watch {% endif  %}</w:t>
-      </w:r>
-      <w:hyperlink r:id="rId12" w:history="1">
+        <w:t xml:space="preserve">Watch </w:t>
+      </w:r>
+      <w:hyperlink r:id="rId14" w:history="1">
         <w:r>
           <w:rPr>
             <w:rStyle w:val="Hyperlink"/>
@@ -230,6 +296,33 @@
           <w:t>Marital Property and Debt</w:t>
         </w:r>
       </w:hyperlink>
+    </w:p>
+    <w:p>
+      <w:pPr>
+        <w:pStyle w:val="Body"/>
+        <w:spacing w:before="54"/>
+      </w:pPr>
+      <w:r>
+        <w:rPr>
+          <w:rStyle w:val="Hyperlink"/>
+          <w:color w:val="FFC000"/>
+        </w:rPr>
+        <w:t>{%</w:t>
+      </w:r>
+      <w:r>
+        <w:rPr>
+          <w:rStyle w:val="Hyperlink"/>
+          <w:color w:val="FFC000"/>
+        </w:rPr>
+        <w:t>p</w:t>
+      </w:r>
+      <w:r>
+        <w:rPr>
+          <w:rStyle w:val="Hyperlink"/>
+          <w:color w:val="FFC000"/>
+        </w:rPr>
+        <w:t xml:space="preserve"> endif %}</w:t>
+      </w:r>
     </w:p>
     <w:p>
       <w:pPr>
@@ -247,7 +340,43 @@
         <w:pStyle w:val="Body"/>
       </w:pPr>
       <w:r>
-        <w:t xml:space="preserve">  {% if user_need in(‘answer custody’, ‘answer divorce’) and type_of_response[‘case in 2 states’] and stage_of_other_case == ‘ended with order’ %}If you ask to dismiss the case, ${ other_party_in_case }{% else %}{{ capitalize(other_party_in_case) }}{% endif %} may file a response or "opposition."</w:t>
+        <w:rPr>
+          <w:color w:val="FFC000"/>
+        </w:rPr>
+        <w:t>{% if user_need in(‘answer custody’, ‘answer divorce’) and type_of_response[‘case in 2 states’] and stage_of_other_case == ‘ended with order’ %}</w:t>
+      </w:r>
+      <w:r>
+        <w:t xml:space="preserve">If you ask to dismiss the case, </w:t>
+      </w:r>
+      <w:r>
+        <w:t>{</w:t>
+      </w:r>
+      <w:r>
+        <w:t xml:space="preserve">{ other_party_in_case </w:t>
+      </w:r>
+      <w:r>
+        <w:t>}</w:t>
+      </w:r>
+      <w:r>
+        <w:t>}</w:t>
+      </w:r>
+      <w:r>
+        <w:rPr>
+          <w:color w:val="FFC000"/>
+        </w:rPr>
+        <w:t>{% else %}</w:t>
+      </w:r>
+      <w:r>
+        <w:t>{{ capitalize(other_party_in_case) }}</w:t>
+      </w:r>
+      <w:r>
+        <w:rPr>
+          <w:color w:val="FFC000"/>
+        </w:rPr>
+        <w:t>{% endif %}</w:t>
+      </w:r>
+      <w:r>
+        <w:t xml:space="preserve"> may file a response or "opposition."</w:t>
       </w:r>
     </w:p>
     <w:p>
@@ -256,6 +385,7 @@
         <w:spacing w:before="54"/>
       </w:pPr>
       <w:r>
+        <w:lastRenderedPageBreak/>
         <w:t>If the {{ other_party_in_case }} files a response, you can file a reply to give the judge new information that answers their opposition. You do not need to repeat what you put in your original motion.</w:t>
       </w:r>
     </w:p>
@@ -270,9 +400,19 @@
         <w:ind w:left="510"/>
       </w:pPr>
       <w:r>
-        <w:t>Use Reply Response, TF 708 [].</w:t>
-      </w:r>
-      <w:hyperlink r:id="rId13" w:history="1">
+        <w:t xml:space="preserve">Use </w:t>
+      </w:r>
+      <w:r>
+        <w:rPr>
+          <w:b/>
+          <w:bCs/>
+        </w:rPr>
+        <w:t>Reply Response, TF 708</w:t>
+      </w:r>
+      <w:r>
+        <w:t xml:space="preserve"> [</w:t>
+      </w:r>
+      <w:hyperlink r:id="rId15" w:history="1">
         <w:r>
           <w:rPr>
             <w:rStyle w:val="Hyperlink"/>
@@ -280,6 +420,9 @@
           <w:t>Fill in PDF</w:t>
         </w:r>
       </w:hyperlink>
+      <w:r>
+        <w:t>].</w:t>
+      </w:r>
     </w:p>
     <w:p>
       <w:pPr>
@@ -292,7 +435,7 @@
         <w:ind w:left="510"/>
       </w:pPr>
       <w:r>
-        <w:t xml:space="preserve"> Watch 2 videos:</w:t>
+        <w:t>Watch 2 videos:</w:t>
       </w:r>
     </w:p>
     <w:p>
@@ -305,7 +448,7 @@
         <w:spacing w:before="54" w:beforeAutospacing="1" w:afterAutospacing="1"/>
         <w:ind w:left="960"/>
       </w:pPr>
-      <w:hyperlink r:id="rId14" w:history="1">
+      <w:hyperlink r:id="rId16" w:history="1">
         <w:r>
           <w:rPr>
             <w:rStyle w:val="Hyperlink"/>
@@ -327,7 +470,7 @@
         <w:spacing w:before="54" w:beforeAutospacing="1" w:afterAutospacing="1"/>
         <w:ind w:left="960"/>
       </w:pPr>
-      <w:hyperlink r:id="rId15" w:history="1">
+      <w:hyperlink r:id="rId17" w:history="1">
         <w:r>
           <w:rPr>
             <w:rStyle w:val="Hyperlink"/>
@@ -350,7 +493,7 @@
         <w:ind w:left="510"/>
       </w:pPr>
       <w:r>
-        <w:t xml:space="preserve">  Read:</w:t>
+        <w:t>Read:</w:t>
       </w:r>
     </w:p>
     <w:p>
@@ -363,7 +506,7 @@
         <w:spacing w:before="54" w:beforeAutospacing="1" w:afterAutospacing="1"/>
         <w:ind w:left="960"/>
       </w:pPr>
-      <w:hyperlink r:id="rId16" w:anchor="reply" w:history="1">
+      <w:hyperlink r:id="rId18" w:history="1">
         <w:r>
           <w:rPr>
             <w:rStyle w:val="Hyperlink"/>
@@ -388,7 +531,22 @@
         <w:pStyle w:val="Body"/>
       </w:pPr>
       <w:r>
-        <w:t xml:space="preserve">  {%p if user_need in('answer custody', 'answer divorce') and type_of_response['case in 2 states'] and stage_of_other_case == 'ended with order'%}</w:t>
+        <w:rPr>
+          <w:color w:val="FFC000"/>
+        </w:rPr>
+        <w:t>{%p if user_need in('answer custody', 'answer divorce') and type_of_response['case in 2 states'] and stage_of_other_case == 'ended with order'</w:t>
+      </w:r>
+      <w:r>
+        <w:rPr>
+          <w:color w:val="FFC000"/>
+        </w:rPr>
+        <w:t xml:space="preserve"> </w:t>
+      </w:r>
+      <w:r>
+        <w:rPr>
+          <w:color w:val="FFC000"/>
+        </w:rPr>
+        <w:t>%}</w:t>
       </w:r>
     </w:p>
     <w:p>
@@ -408,7 +566,10 @@
         <w:pStyle w:val="Body"/>
       </w:pPr>
       <w:r>
-        <w:t xml:space="preserve">  {%p endif %}</w:t>
+        <w:rPr>
+          <w:color w:val="FFC000"/>
+        </w:rPr>
+        <w:t>{%p endif %}</w:t>
       </w:r>
     </w:p>
     <w:p>
@@ -416,47 +577,665 @@
         <w:pStyle w:val="Body"/>
       </w:pPr>
       <w:r>
-        <w:t xml:space="preserve">  {%p endif %}</w:t>
+        <w:rPr>
+          <w:color w:val="FF0000"/>
+        </w:rPr>
+        <w:t>{%p endif %}</w:t>
       </w:r>
     </w:p>
     <w:p>
       <w:pPr>
-        <w:pStyle w:val="Body"/>
-      </w:pPr>
+        <w:pStyle w:val="Heading3"/>
+        <w:rPr>
+          <w:color w:val="auto"/>
+        </w:rPr>
+      </w:pPr>
+      <w:r>
+        <w:t>Links in this step</w:t>
+      </w:r>
     </w:p>
     <w:p>
       <w:pPr>
         <w:pStyle w:val="Body"/>
       </w:pPr>
+      <w:r>
+        <w:rPr>
+          <w:color w:val="FF0000"/>
+        </w:rPr>
+        <w:t>{%p if user_need in('answer custody', 'answer divorce') and type_of_response['case in 2 states'] and stage_of_other_case == 'still going'%}</w:t>
+      </w:r>
     </w:p>
     <w:p>
       <w:pPr>
         <w:pStyle w:val="Body"/>
-      </w:pPr>
+        <w:spacing w:before="54"/>
+      </w:pPr>
+      <w:hyperlink r:id="rId19" w:history="1">
+        <w:r>
+          <w:rPr>
+            <w:rStyle w:val="Hyperlink"/>
+          </w:rPr>
+          <w:t>Talking to a lawyer</w:t>
+        </w:r>
+      </w:hyperlink>
+      <w:r>
+        <w:br/>
+      </w:r>
+      <w:hyperlink r:id="rId20" w:history="1">
+        <w:r>
+          <w:rPr>
+            <w:rStyle w:val="Hyperlink"/>
+            <w:spacing w:val="0"/>
+          </w:rPr>
+          <w:t>ak-courts.info/</w:t>
+        </w:r>
+        <w:proofErr w:type="spellStart"/>
+        <w:r>
+          <w:rPr>
+            <w:rStyle w:val="Hyperlink"/>
+            <w:spacing w:val="0"/>
+          </w:rPr>
+          <w:t>findlawyer</w:t>
+        </w:r>
+        <w:proofErr w:type="spellEnd"/>
+      </w:hyperlink>
     </w:p>
     <w:p>
       <w:pPr>
         <w:pStyle w:val="Body"/>
-      </w:pPr>
+        <w:spacing w:before="54"/>
+        <w:rPr>
+          <w:color w:val="FF0000"/>
+        </w:rPr>
+      </w:pPr>
+      <w:r>
+        <w:rPr>
+          <w:color w:val="FF0000"/>
+        </w:rPr>
+        <w:t>{%p elif (user_need == 'answer custody' and type_of_response.all_true('ak custody case', exclusive = True)) or (user_need == 'answer divorce' and type_of_response.all_true('ak divorce case', exclusive = True)) or (type_of_response['case in 2 states'] and not type_of_response['default'] and stage_of_other_case == 'ended with no order') %}</w:t>
+      </w:r>
     </w:p>
     <w:p>
       <w:pPr>
         <w:pStyle w:val="Body"/>
-      </w:pPr>
+        <w:spacing w:before="54"/>
+      </w:pPr>
+      <w:r>
+        <w:rPr>
+          <w:color w:val="FFC000"/>
+        </w:rPr>
+        <w:t>{%p if user_need == 'answer divorce' and not (type_of_response['case in 2 states'] and stage_of_other_case in ('still going', 'ended with order'))</w:t>
+      </w:r>
+      <w:r>
+        <w:rPr>
+          <w:color w:val="FFC000"/>
+        </w:rPr>
+        <w:t xml:space="preserve"> </w:t>
+      </w:r>
+      <w:r>
+        <w:rPr>
+          <w:color w:val="FFC000"/>
+        </w:rPr>
+        <w:t>%}</w:t>
+      </w:r>
     </w:p>
     <w:p>
       <w:pPr>
         <w:pStyle w:val="Body"/>
-      </w:pPr>
+        <w:spacing w:before="54" w:beforeAutospacing="1" w:afterAutospacing="1"/>
+      </w:pPr>
+      <w:r>
+        <w:rPr>
+          <w:b/>
+          <w:bCs/>
+        </w:rPr>
+        <w:t>Civil Rule 26.1 Questionnaire, SHC-1010</w:t>
+      </w:r>
+      <w:r>
+        <w:rPr>
+          <w:b/>
+          <w:bCs/>
+        </w:rPr>
+        <w:br/>
+      </w:r>
+      <w:r>
+        <w:t xml:space="preserve">as a </w:t>
+      </w:r>
+      <w:hyperlink r:id="rId21" w:history="1">
+        <w:r>
+          <w:rPr>
+            <w:rStyle w:val="Hyperlink"/>
+          </w:rPr>
+          <w:t>Word</w:t>
+        </w:r>
+      </w:hyperlink>
+      <w:r>
+        <w:rPr>
+          <w:b/>
+          <w:bCs/>
+        </w:rPr>
+        <w:t xml:space="preserve"> </w:t>
+      </w:r>
+      <w:r>
+        <w:t>file</w:t>
+      </w:r>
+      <w:r>
+        <w:br/>
+      </w:r>
+      <w:hyperlink r:id="rId22" w:history="1">
+        <w:r>
+          <w:rPr>
+            <w:rStyle w:val="Hyperlink"/>
+            <w:spacing w:val="0"/>
+          </w:rPr>
+          <w:t>courts.alaska.gov/</w:t>
+        </w:r>
+        <w:proofErr w:type="spellStart"/>
+        <w:r>
+          <w:rPr>
+            <w:rStyle w:val="Hyperlink"/>
+            <w:spacing w:val="0"/>
+          </w:rPr>
+          <w:t>shc</w:t>
+        </w:r>
+        <w:proofErr w:type="spellEnd"/>
+        <w:r>
+          <w:rPr>
+            <w:rStyle w:val="Hyperlink"/>
+            <w:spacing w:val="0"/>
+          </w:rPr>
+          <w:t>/family/docs/shc-1010.doc</w:t>
+        </w:r>
+      </w:hyperlink>
+      <w:r>
+        <w:br/>
+        <w:t>as a</w:t>
+      </w:r>
+      <w:r>
+        <w:rPr>
+          <w:b/>
+          <w:bCs/>
+        </w:rPr>
+        <w:t xml:space="preserve"> </w:t>
+      </w:r>
+      <w:hyperlink r:id="rId23" w:history="1">
+        <w:r>
+          <w:rPr>
+            <w:rStyle w:val="Hyperlink"/>
+          </w:rPr>
+          <w:t>PDF</w:t>
+        </w:r>
+      </w:hyperlink>
+      <w:r>
+        <w:rPr>
+          <w:rStyle w:val="Hyperlink"/>
+        </w:rPr>
+        <w:br/>
+      </w:r>
+      <w:hyperlink r:id="rId24" w:history="1">
+        <w:r>
+          <w:rPr>
+            <w:rStyle w:val="Hyperlink"/>
+            <w:spacing w:val="0"/>
+          </w:rPr>
+          <w:t>courts.alaska.gov/</w:t>
+        </w:r>
+        <w:proofErr w:type="spellStart"/>
+        <w:r>
+          <w:rPr>
+            <w:rStyle w:val="Hyperlink"/>
+            <w:spacing w:val="0"/>
+          </w:rPr>
+          <w:t>shc</w:t>
+        </w:r>
+        <w:proofErr w:type="spellEnd"/>
+        <w:r>
+          <w:rPr>
+            <w:rStyle w:val="Hyperlink"/>
+            <w:spacing w:val="0"/>
+          </w:rPr>
+          <w:t>/family/docs/shc-1010n.pdf</w:t>
+        </w:r>
+      </w:hyperlink>
     </w:p>
-    <w:p/>
+    <w:p>
+      <w:pPr>
+        <w:pStyle w:val="Body"/>
+        <w:spacing w:before="54" w:beforeAutospacing="1" w:afterAutospacing="1"/>
+      </w:pPr>
+      <w:r>
+        <w:rPr>
+          <w:b/>
+          <w:bCs/>
+        </w:rPr>
+        <w:t>Property &amp; Debt Worksheet, SHC-1000</w:t>
+      </w:r>
+      <w:r>
+        <w:br/>
+        <w:t xml:space="preserve">as a </w:t>
+      </w:r>
+      <w:hyperlink r:id="rId25" w:history="1">
+        <w:r>
+          <w:rPr>
+            <w:rStyle w:val="Hyperlink"/>
+          </w:rPr>
+          <w:t>Word</w:t>
+        </w:r>
+      </w:hyperlink>
+      <w:r>
+        <w:t xml:space="preserve"> </w:t>
+      </w:r>
+      <w:r>
+        <w:t>file</w:t>
+      </w:r>
+      <w:r>
+        <w:br/>
+      </w:r>
+      <w:hyperlink r:id="rId26" w:history="1">
+        <w:r>
+          <w:rPr>
+            <w:rStyle w:val="Hyperlink"/>
+            <w:spacing w:val="0"/>
+          </w:rPr>
+          <w:t>courts.alaska.gov/</w:t>
+        </w:r>
+        <w:proofErr w:type="spellStart"/>
+        <w:r>
+          <w:rPr>
+            <w:rStyle w:val="Hyperlink"/>
+            <w:spacing w:val="0"/>
+          </w:rPr>
+          <w:t>shc</w:t>
+        </w:r>
+        <w:proofErr w:type="spellEnd"/>
+        <w:r>
+          <w:rPr>
+            <w:rStyle w:val="Hyperlink"/>
+            <w:spacing w:val="0"/>
+          </w:rPr>
+          <w:t>/family/docs/shc-1000.doc</w:t>
+        </w:r>
+      </w:hyperlink>
+      <w:r>
+        <w:br/>
+        <w:t xml:space="preserve">as a </w:t>
+      </w:r>
+      <w:hyperlink r:id="rId27" w:history="1">
+        <w:r>
+          <w:rPr>
+            <w:rStyle w:val="Hyperlink"/>
+          </w:rPr>
+          <w:t>PDF</w:t>
+        </w:r>
+      </w:hyperlink>
+      <w:r>
+        <w:rPr>
+          <w:rStyle w:val="Hyperlink"/>
+        </w:rPr>
+        <w:br/>
+      </w:r>
+      <w:hyperlink r:id="rId28" w:history="1">
+        <w:r>
+          <w:rPr>
+            <w:rStyle w:val="Hyperlink"/>
+            <w:spacing w:val="0"/>
+          </w:rPr>
+          <w:t>courts.alaska.gov/</w:t>
+        </w:r>
+        <w:proofErr w:type="spellStart"/>
+        <w:r>
+          <w:rPr>
+            <w:rStyle w:val="Hyperlink"/>
+            <w:spacing w:val="0"/>
+          </w:rPr>
+          <w:t>shc</w:t>
+        </w:r>
+        <w:proofErr w:type="spellEnd"/>
+        <w:r>
+          <w:rPr>
+            <w:rStyle w:val="Hyperlink"/>
+            <w:spacing w:val="0"/>
+          </w:rPr>
+          <w:t>/family/docs/shc-1000n.pdf</w:t>
+        </w:r>
+      </w:hyperlink>
+    </w:p>
+    <w:p>
+      <w:pPr>
+        <w:pStyle w:val="Body"/>
+        <w:rPr>
+          <w:rStyle w:val="Hyperlink"/>
+        </w:rPr>
+      </w:pPr>
+      <w:hyperlink r:id="rId29" w:history="1">
+        <w:r>
+          <w:rPr>
+            <w:rStyle w:val="Hyperlink"/>
+          </w:rPr>
+          <w:t>Dividing</w:t>
+        </w:r>
+        <w:r>
+          <w:rPr>
+            <w:rStyle w:val="Hyperlink"/>
+          </w:rPr>
+          <w:t xml:space="preserve"> </w:t>
+        </w:r>
+        <w:r>
+          <w:rPr>
+            <w:rStyle w:val="Hyperlink"/>
+          </w:rPr>
+          <w:t>Property</w:t>
+        </w:r>
+        <w:r>
+          <w:rPr>
+            <w:rStyle w:val="Hyperlink"/>
+          </w:rPr>
+          <w:t xml:space="preserve"> </w:t>
+        </w:r>
+        <w:r>
+          <w:rPr>
+            <w:rStyle w:val="Hyperlink"/>
+          </w:rPr>
+          <w:t>&amp;</w:t>
+        </w:r>
+        <w:r>
+          <w:rPr>
+            <w:rStyle w:val="Hyperlink"/>
+          </w:rPr>
+          <w:t xml:space="preserve"> </w:t>
+        </w:r>
+        <w:r>
+          <w:rPr>
+            <w:rStyle w:val="Hyperlink"/>
+          </w:rPr>
+          <w:t>Debt</w:t>
+        </w:r>
+      </w:hyperlink>
+      <w:r>
+        <w:rPr>
+          <w:rStyle w:val="Hyperlink"/>
+        </w:rPr>
+        <w:br/>
+      </w:r>
+      <w:hyperlink r:id="rId30" w:history="1">
+        <w:r>
+          <w:rPr>
+            <w:rStyle w:val="Hyperlink"/>
+          </w:rPr>
+          <w:t>ak-courts.info/property</w:t>
+        </w:r>
+      </w:hyperlink>
+    </w:p>
+    <w:p>
+      <w:pPr>
+        <w:pStyle w:val="Body"/>
+        <w:spacing w:before="54"/>
+        <w:rPr>
+          <w:rStyle w:val="Hyperlink"/>
+          <w:color w:val="auto"/>
+        </w:rPr>
+      </w:pPr>
+      <w:hyperlink r:id="rId31" w:history="1">
+        <w:r>
+          <w:rPr>
+            <w:rStyle w:val="Hyperlink"/>
+          </w:rPr>
+          <w:t>Marital Property and Debt</w:t>
+        </w:r>
+      </w:hyperlink>
+      <w:r>
+        <w:rPr>
+          <w:rStyle w:val="Hyperlink"/>
+        </w:rPr>
+        <w:br/>
+      </w:r>
+      <w:r>
+        <w:rPr>
+          <w:rStyle w:val="Hyperlink"/>
+        </w:rPr>
+        <w:t>https://youtu.be/PTpeFwVSY-o?si=M8kis_SAeRHfylOZ</w:t>
+      </w:r>
+    </w:p>
+    <w:p>
+      <w:pPr>
+        <w:pStyle w:val="Body"/>
+        <w:spacing w:before="54"/>
+      </w:pPr>
+      <w:r>
+        <w:rPr>
+          <w:rStyle w:val="Hyperlink"/>
+          <w:color w:val="FFC000"/>
+        </w:rPr>
+        <w:t>{%p endif %}</w:t>
+      </w:r>
+    </w:p>
+    <w:p>
+      <w:pPr>
+        <w:pStyle w:val="Body"/>
+      </w:pPr>
+      <w:r>
+        <w:rPr>
+          <w:color w:val="FF0000"/>
+        </w:rPr>
+        <w:t>{%p else %}</w:t>
+      </w:r>
+    </w:p>
+    <w:p>
+      <w:pPr>
+        <w:pStyle w:val="Body"/>
+        <w:spacing w:before="54" w:beforeAutospacing="1" w:afterAutospacing="1"/>
+      </w:pPr>
+      <w:r>
+        <w:rPr>
+          <w:b/>
+          <w:bCs/>
+        </w:rPr>
+        <w:t>Reply Response, TF 708</w:t>
+      </w:r>
+      <w:r>
+        <w:t xml:space="preserve"> [</w:t>
+      </w:r>
+      <w:hyperlink r:id="rId32" w:history="1">
+        <w:r>
+          <w:rPr>
+            <w:rStyle w:val="Hyperlink"/>
+          </w:rPr>
+          <w:t xml:space="preserve">Fill </w:t>
+        </w:r>
+        <w:r>
+          <w:rPr>
+            <w:rStyle w:val="Hyperlink"/>
+          </w:rPr>
+          <w:t>i</w:t>
+        </w:r>
+        <w:r>
+          <w:rPr>
+            <w:rStyle w:val="Hyperlink"/>
+          </w:rPr>
+          <w:t>n PDF</w:t>
+        </w:r>
+      </w:hyperlink>
+      <w:r>
+        <w:t>]</w:t>
+      </w:r>
+      <w:r>
+        <w:br/>
+      </w:r>
+      <w:hyperlink r:id="rId33" w:history="1">
+        <w:r>
+          <w:rPr>
+            <w:rStyle w:val="Hyperlink"/>
+            <w:spacing w:val="0"/>
+          </w:rPr>
+          <w:t>ak-courts.info/tf708</w:t>
+        </w:r>
+      </w:hyperlink>
+    </w:p>
+    <w:p>
+      <w:pPr>
+        <w:pStyle w:val="Body"/>
+        <w:spacing w:before="54" w:beforeAutospacing="1" w:afterAutospacing="1"/>
+      </w:pPr>
+      <w:hyperlink r:id="rId34" w:history="1">
+        <w:r>
+          <w:rPr>
+            <w:rStyle w:val="Hyperlink"/>
+          </w:rPr>
+          <w:t>Motions Part 3: Preparing a Reply</w:t>
+        </w:r>
+      </w:hyperlink>
+      <w:r>
+        <w:br/>
+      </w:r>
+      <w:hyperlink r:id="rId35" w:history="1">
+        <w:r>
+          <w:rPr>
+            <w:rStyle w:val="Hyperlink"/>
+            <w:spacing w:val="0"/>
+          </w:rPr>
+          <w:t>youtube.com/</w:t>
+        </w:r>
+        <w:proofErr w:type="spellStart"/>
+        <w:r>
+          <w:rPr>
+            <w:rStyle w:val="Hyperlink"/>
+            <w:spacing w:val="0"/>
+          </w:rPr>
+          <w:t>watch?v</w:t>
+        </w:r>
+        <w:proofErr w:type="spellEnd"/>
+        <w:r>
+          <w:rPr>
+            <w:rStyle w:val="Hyperlink"/>
+            <w:spacing w:val="0"/>
+          </w:rPr>
+          <w:t>=</w:t>
+        </w:r>
+        <w:proofErr w:type="spellStart"/>
+        <w:r>
+          <w:rPr>
+            <w:rStyle w:val="Hyperlink"/>
+            <w:spacing w:val="0"/>
+          </w:rPr>
+          <w:t>egoBeRFB_Uw</w:t>
+        </w:r>
+      </w:hyperlink>
+      <w:proofErr w:type="spellEnd"/>
+    </w:p>
+    <w:p>
+      <w:pPr>
+        <w:pStyle w:val="Body"/>
+        <w:spacing w:before="54" w:beforeAutospacing="1" w:afterAutospacing="1"/>
+      </w:pPr>
+      <w:hyperlink r:id="rId36" w:history="1">
+        <w:r>
+          <w:rPr>
+            <w:rStyle w:val="Hyperlink"/>
+          </w:rPr>
+          <w:t>Motions Part 4: Mailings and Deadlines</w:t>
+        </w:r>
+      </w:hyperlink>
+      <w:r>
+        <w:rPr>
+          <w:rStyle w:val="Hyperlink"/>
+        </w:rPr>
+        <w:br/>
+      </w:r>
+      <w:hyperlink r:id="rId37" w:history="1">
+        <w:r>
+          <w:rPr>
+            <w:rStyle w:val="Hyperlink"/>
+            <w:spacing w:val="0"/>
+          </w:rPr>
+          <w:t>youtube.com/</w:t>
+        </w:r>
+        <w:proofErr w:type="spellStart"/>
+        <w:r>
+          <w:rPr>
+            <w:rStyle w:val="Hyperlink"/>
+            <w:spacing w:val="0"/>
+          </w:rPr>
+          <w:t>watch?v</w:t>
+        </w:r>
+        <w:proofErr w:type="spellEnd"/>
+        <w:r>
+          <w:rPr>
+            <w:rStyle w:val="Hyperlink"/>
+            <w:spacing w:val="0"/>
+          </w:rPr>
+          <w:t>=YQvG7GEGeoo</w:t>
+        </w:r>
+      </w:hyperlink>
+    </w:p>
+    <w:p>
+      <w:pPr>
+        <w:pStyle w:val="Body"/>
+        <w:spacing w:before="54" w:beforeAutospacing="1" w:afterAutospacing="1"/>
+      </w:pPr>
+      <w:hyperlink r:id="rId38" w:history="1">
+        <w:r>
+          <w:rPr>
+            <w:rStyle w:val="Hyperlink"/>
+          </w:rPr>
+          <w:t>How do I reply to a</w:t>
+        </w:r>
+        <w:r>
+          <w:rPr>
+            <w:rStyle w:val="Hyperlink"/>
+          </w:rPr>
+          <w:t>n</w:t>
+        </w:r>
+        <w:r>
+          <w:rPr>
+            <w:rStyle w:val="Hyperlink"/>
+          </w:rPr>
+          <w:t xml:space="preserve"> opposition?</w:t>
+        </w:r>
+      </w:hyperlink>
+      <w:r>
+        <w:rPr>
+          <w:rStyle w:val="Hyperlink"/>
+          <w:color w:val="auto"/>
+        </w:rPr>
+        <w:br/>
+      </w:r>
+      <w:hyperlink r:id="rId39" w:history="1">
+        <w:r>
+          <w:rPr>
+            <w:rStyle w:val="Hyperlink"/>
+            <w:spacing w:val="0"/>
+          </w:rPr>
+          <w:t>ak-courts.info/</w:t>
+        </w:r>
+        <w:proofErr w:type="spellStart"/>
+        <w:r>
+          <w:rPr>
+            <w:rStyle w:val="Hyperlink"/>
+            <w:spacing w:val="0"/>
+          </w:rPr>
+          <w:t>motreply</w:t>
+        </w:r>
+        <w:proofErr w:type="spellEnd"/>
+      </w:hyperlink>
+    </w:p>
+    <w:p>
+      <w:pPr>
+        <w:pStyle w:val="Body"/>
+      </w:pPr>
+      <w:r>
+        <w:rPr>
+          <w:color w:val="FF0000"/>
+        </w:rPr>
+        <w:t>{%p endif %}</w:t>
+      </w:r>
+    </w:p>
     <w:sectPr>
-      <w:headerReference w:type="default" r:id="rId19"/>
-      <w:headerReference w:type="first" r:id="rId20"/>
-      <w:headerReference w:type="even" r:id="rId21"/>
-      <w:footerReference w:type="default" r:id="rId22"/>
-      <w:footerReference w:type="first" r:id="rId23"/>
-      <w:footerReference w:type="even" r:id="rId24"/>
+      <w:headerReference w:type="even" r:id="rId40"/>
+      <w:headerReference w:type="default" r:id="rId41"/>
+      <w:footerReference w:type="even" r:id="rId42"/>
+      <w:footerReference w:type="default" r:id="rId43"/>
+      <w:headerReference w:type="first" r:id="rId44"/>
+      <w:footerReference w:type="first" r:id="rId45"/>
       <w:pgSz w:w="12240" w:h="15840"/>
       <w:pgMar w:top="1440" w:right="1440" w:bottom="1440" w:left="1440" w:header="720" w:footer="720" w:gutter="0"/>
       <w:cols w:space="720"/>
@@ -466,8 +1245,33 @@
 </w:document>
 </file>
 
+<file path=word/endnotes.xml><?xml version="1.0" encoding="utf-8"?>
+<w:endnotes xmlns:wpc="http://schemas.microsoft.com/office/word/2010/wordprocessingCanvas" xmlns:cx="http://schemas.microsoft.com/office/drawing/2014/chartex" xmlns:cx1="http://schemas.microsoft.com/office/drawing/2015/9/8/chartex" xmlns:cx2="http://schemas.microsoft.com/office/drawing/2015/10/21/chartex" xmlns:cx3="http://schemas.microsoft.com/office/drawing/2016/5/9/chartex" xmlns:cx4="http://schemas.microsoft.com/office/drawing/2016/5/10/chartex" xmlns:cx5="http://schemas.microsoft.com/office/drawing/2016/5/11/chartex" xmlns:cx6="http://schemas.microsoft.com/office/drawing/2016/5/12/chartex" xmlns:cx7="http://schemas.microsoft.com/office/drawing/2016/5/13/chartex" xmlns:cx8="http://schemas.microsoft.com/office/drawing/2016/5/14/chartex" xmlns:mc="http://schemas.openxmlformats.org/markup-compatibility/2006" xmlns:aink="http://schemas.microsoft.com/office/drawing/2016/ink" xmlns:am3d="http://schemas.microsoft.com/office/drawing/2017/model3d" xmlns:o="urn:schemas-microsoft-com:office:office" xmlns:r="http://schemas.openxmlformats.org/officeDocument/2006/relationships" xmlns:m="http://schemas.openxmlformats.org/officeDocument/2006/math" xmlns:v="urn:schemas-microsoft-com:vml" xmlns:wp14="http://schemas.microsoft.com/office/word/2010/wordprocessingDrawing" xmlns:wp="http://schemas.openxmlformats.org/drawingml/2006/wordprocessingDrawing" xmlns:w10="urn:schemas-microsoft-com:office:word" xmlns:w="http://schemas.openxmlformats.org/wordprocessingml/2006/main" xmlns:w14="http://schemas.microsoft.com/office/word/2010/wordml" xmlns:w15="http://schemas.microsoft.com/office/word/2012/wordml" xmlns:w16cex="http://schemas.microsoft.com/office/word/2018/wordml/cex" xmlns:w16cid="http://schemas.microsoft.com/office/word/2016/wordml/cid" xmlns:w16="http://schemas.microsoft.com/office/word/2018/wordml" xmlns:w16sdtdh="http://schemas.microsoft.com/office/word/2020/wordml/sdtdatahash" xmlns:w16se="http://schemas.microsoft.com/office/word/2015/wordml/symex" xmlns:wpg="http://schemas.microsoft.com/office/word/2010/wordprocessingGroup" xmlns:wpi="http://schemas.microsoft.com/office/word/2010/wordprocessingInk" xmlns:wne="http://schemas.microsoft.com/office/word/2006/wordml" xmlns:wps="http://schemas.microsoft.com/office/word/2010/wordprocessingShape" mc:Ignorable="w14 w15 w16se w16cid w16 w16cex w16sdtdh wp14">
+  <w:endnote w:type="separator" w:id="-1">
+    <w:p>
+      <w:pPr>
+        <w:spacing w:before="0" w:after="0"/>
+      </w:pPr>
+      <w:r>
+        <w:separator/>
+      </w:r>
+    </w:p>
+  </w:endnote>
+  <w:endnote w:type="continuationSeparator" w:id="0">
+    <w:p>
+      <w:pPr>
+        <w:spacing w:before="0" w:after="0"/>
+      </w:pPr>
+      <w:r>
+        <w:continuationSeparator/>
+      </w:r>
+    </w:p>
+  </w:endnote>
+</w:endnotes>
+</file>
+
 <file path=word/footer1.xml><?xml version="1.0" encoding="utf-8"?>
-<w:ftr xmlns:m="http://schemas.openxmlformats.org/officeDocument/2006/math" xmlns:mc="http://schemas.openxmlformats.org/markup-compatibility/2006" xmlns:mo="http://schemas.microsoft.com/office/mac/office/2008/main" xmlns:mv="urn:schemas-microsoft-com:mac:vml" xmlns:o="urn:schemas-microsoft-com:office:office" xmlns:r="http://schemas.openxmlformats.org/officeDocument/2006/relationships" xmlns:v="urn:schemas-microsoft-com:vml" xmlns:w10="urn:schemas-microsoft-com:office:word" xmlns:w14="http://schemas.microsoft.com/office/word/2010/wordml" xmlns:w="http://schemas.openxmlformats.org/wordprocessingml/2006/main" xmlns:wne="http://schemas.microsoft.com/office/word/2006/wordml" xmlns:wp14="http://schemas.microsoft.com/office/word/2010/wordprocessingDrawing" xmlns:wp="http://schemas.openxmlformats.org/drawingml/2006/wordprocessingDrawing" xmlns:wpc="http://schemas.microsoft.com/office/word/2010/wordprocessingCanvas" xmlns:wpg="http://schemas.microsoft.com/office/word/2010/wordprocessingGroup" xmlns:wpi="http://schemas.microsoft.com/office/word/2010/wordprocessingInk" xmlns:wps="http://schemas.microsoft.com/office/word/2010/wordprocessingShape" mc:Ignorable="w14 wp14">
+<w:ftr xmlns:wpc="http://schemas.microsoft.com/office/word/2010/wordprocessingCanvas" xmlns:cx="http://schemas.microsoft.com/office/drawing/2014/chartex" xmlns:cx1="http://schemas.microsoft.com/office/drawing/2015/9/8/chartex" xmlns:cx2="http://schemas.microsoft.com/office/drawing/2015/10/21/chartex" xmlns:cx3="http://schemas.microsoft.com/office/drawing/2016/5/9/chartex" xmlns:cx4="http://schemas.microsoft.com/office/drawing/2016/5/10/chartex" xmlns:cx5="http://schemas.microsoft.com/office/drawing/2016/5/11/chartex" xmlns:cx6="http://schemas.microsoft.com/office/drawing/2016/5/12/chartex" xmlns:cx7="http://schemas.microsoft.com/office/drawing/2016/5/13/chartex" xmlns:cx8="http://schemas.microsoft.com/office/drawing/2016/5/14/chartex" xmlns:mc="http://schemas.openxmlformats.org/markup-compatibility/2006" xmlns:aink="http://schemas.microsoft.com/office/drawing/2016/ink" xmlns:am3d="http://schemas.microsoft.com/office/drawing/2017/model3d" xmlns:o="urn:schemas-microsoft-com:office:office" xmlns:r="http://schemas.openxmlformats.org/officeDocument/2006/relationships" xmlns:m="http://schemas.openxmlformats.org/officeDocument/2006/math" xmlns:v="urn:schemas-microsoft-com:vml" xmlns:wp14="http://schemas.microsoft.com/office/word/2010/wordprocessingDrawing" xmlns:wp="http://schemas.openxmlformats.org/drawingml/2006/wordprocessingDrawing" xmlns:w10="urn:schemas-microsoft-com:office:word" xmlns:w="http://schemas.openxmlformats.org/wordprocessingml/2006/main" xmlns:w14="http://schemas.microsoft.com/office/word/2010/wordml" xmlns:w15="http://schemas.microsoft.com/office/word/2012/wordml" xmlns:w16cex="http://schemas.microsoft.com/office/word/2018/wordml/cex" xmlns:w16cid="http://schemas.microsoft.com/office/word/2016/wordml/cid" xmlns:w16="http://schemas.microsoft.com/office/word/2018/wordml" xmlns:w16sdtdh="http://schemas.microsoft.com/office/word/2020/wordml/sdtdatahash" xmlns:w16se="http://schemas.microsoft.com/office/word/2015/wordml/symex" xmlns:wpg="http://schemas.microsoft.com/office/word/2010/wordprocessingGroup" xmlns:wpi="http://schemas.microsoft.com/office/word/2010/wordprocessingInk" xmlns:wne="http://schemas.microsoft.com/office/word/2006/wordml" xmlns:wps="http://schemas.microsoft.com/office/word/2010/wordprocessingShape" mc:Ignorable="w14 w15 w16se w16cid w16 w16cex w16sdtdh wp14">
   <w:p>
     <w:pPr>
       <w:pStyle w:val="Footer"/>
@@ -477,7 +1281,7 @@
 </file>
 
 <file path=word/footer2.xml><?xml version="1.0" encoding="utf-8"?>
-<w:ftr xmlns:m="http://schemas.openxmlformats.org/officeDocument/2006/math" xmlns:mc="http://schemas.openxmlformats.org/markup-compatibility/2006" xmlns:mo="http://schemas.microsoft.com/office/mac/office/2008/main" xmlns:mv="urn:schemas-microsoft-com:mac:vml" xmlns:o="urn:schemas-microsoft-com:office:office" xmlns:r="http://schemas.openxmlformats.org/officeDocument/2006/relationships" xmlns:v="urn:schemas-microsoft-com:vml" xmlns:w10="urn:schemas-microsoft-com:office:word" xmlns:w14="http://schemas.microsoft.com/office/word/2010/wordml" xmlns:w="http://schemas.openxmlformats.org/wordprocessingml/2006/main" xmlns:wne="http://schemas.microsoft.com/office/word/2006/wordml" xmlns:wp14="http://schemas.microsoft.com/office/word/2010/wordprocessingDrawing" xmlns:wp="http://schemas.openxmlformats.org/drawingml/2006/wordprocessingDrawing" xmlns:wpc="http://schemas.microsoft.com/office/word/2010/wordprocessingCanvas" xmlns:wpg="http://schemas.microsoft.com/office/word/2010/wordprocessingGroup" xmlns:wpi="http://schemas.microsoft.com/office/word/2010/wordprocessingInk" xmlns:wps="http://schemas.microsoft.com/office/word/2010/wordprocessingShape" mc:Ignorable="w14 wp14">
+<w:ftr xmlns:wpc="http://schemas.microsoft.com/office/word/2010/wordprocessingCanvas" xmlns:cx="http://schemas.microsoft.com/office/drawing/2014/chartex" xmlns:cx1="http://schemas.microsoft.com/office/drawing/2015/9/8/chartex" xmlns:cx2="http://schemas.microsoft.com/office/drawing/2015/10/21/chartex" xmlns:cx3="http://schemas.microsoft.com/office/drawing/2016/5/9/chartex" xmlns:cx4="http://schemas.microsoft.com/office/drawing/2016/5/10/chartex" xmlns:cx5="http://schemas.microsoft.com/office/drawing/2016/5/11/chartex" xmlns:cx6="http://schemas.microsoft.com/office/drawing/2016/5/12/chartex" xmlns:cx7="http://schemas.microsoft.com/office/drawing/2016/5/13/chartex" xmlns:cx8="http://schemas.microsoft.com/office/drawing/2016/5/14/chartex" xmlns:mc="http://schemas.openxmlformats.org/markup-compatibility/2006" xmlns:aink="http://schemas.microsoft.com/office/drawing/2016/ink" xmlns:am3d="http://schemas.microsoft.com/office/drawing/2017/model3d" xmlns:o="urn:schemas-microsoft-com:office:office" xmlns:r="http://schemas.openxmlformats.org/officeDocument/2006/relationships" xmlns:m="http://schemas.openxmlformats.org/officeDocument/2006/math" xmlns:v="urn:schemas-microsoft-com:vml" xmlns:wp14="http://schemas.microsoft.com/office/word/2010/wordprocessingDrawing" xmlns:wp="http://schemas.openxmlformats.org/drawingml/2006/wordprocessingDrawing" xmlns:w10="urn:schemas-microsoft-com:office:word" xmlns:w="http://schemas.openxmlformats.org/wordprocessingml/2006/main" xmlns:w14="http://schemas.microsoft.com/office/word/2010/wordml" xmlns:w15="http://schemas.microsoft.com/office/word/2012/wordml" xmlns:w16cex="http://schemas.microsoft.com/office/word/2018/wordml/cex" xmlns:w16cid="http://schemas.microsoft.com/office/word/2016/wordml/cid" xmlns:w16="http://schemas.microsoft.com/office/word/2018/wordml" xmlns:w16sdtdh="http://schemas.microsoft.com/office/word/2020/wordml/sdtdatahash" xmlns:w16se="http://schemas.microsoft.com/office/word/2015/wordml/symex" xmlns:wpg="http://schemas.microsoft.com/office/word/2010/wordprocessingGroup" xmlns:wpi="http://schemas.microsoft.com/office/word/2010/wordprocessingInk" xmlns:wne="http://schemas.microsoft.com/office/word/2006/wordml" xmlns:wps="http://schemas.microsoft.com/office/word/2010/wordprocessingShape" mc:Ignorable="w14 w15 w16se w16cid w16 w16cex w16sdtdh wp14">
   <w:p>
     <w:pPr>
       <w:pStyle w:val="Footer"/>
@@ -487,7 +1291,7 @@
 </file>
 
 <file path=word/footer3.xml><?xml version="1.0" encoding="utf-8"?>
-<w:ftr xmlns:m="http://schemas.openxmlformats.org/officeDocument/2006/math" xmlns:mc="http://schemas.openxmlformats.org/markup-compatibility/2006" xmlns:mo="http://schemas.microsoft.com/office/mac/office/2008/main" xmlns:mv="urn:schemas-microsoft-com:mac:vml" xmlns:o="urn:schemas-microsoft-com:office:office" xmlns:r="http://schemas.openxmlformats.org/officeDocument/2006/relationships" xmlns:v="urn:schemas-microsoft-com:vml" xmlns:w10="urn:schemas-microsoft-com:office:word" xmlns:w14="http://schemas.microsoft.com/office/word/2010/wordml" xmlns:w="http://schemas.openxmlformats.org/wordprocessingml/2006/main" xmlns:wne="http://schemas.microsoft.com/office/word/2006/wordml" xmlns:wp14="http://schemas.microsoft.com/office/word/2010/wordprocessingDrawing" xmlns:wp="http://schemas.openxmlformats.org/drawingml/2006/wordprocessingDrawing" xmlns:wpc="http://schemas.microsoft.com/office/word/2010/wordprocessingCanvas" xmlns:wpg="http://schemas.microsoft.com/office/word/2010/wordprocessingGroup" xmlns:wpi="http://schemas.microsoft.com/office/word/2010/wordprocessingInk" xmlns:wps="http://schemas.microsoft.com/office/word/2010/wordprocessingShape" mc:Ignorable="w14 wp14">
+<w:ftr xmlns:wpc="http://schemas.microsoft.com/office/word/2010/wordprocessingCanvas" xmlns:cx="http://schemas.microsoft.com/office/drawing/2014/chartex" xmlns:cx1="http://schemas.microsoft.com/office/drawing/2015/9/8/chartex" xmlns:cx2="http://schemas.microsoft.com/office/drawing/2015/10/21/chartex" xmlns:cx3="http://schemas.microsoft.com/office/drawing/2016/5/9/chartex" xmlns:cx4="http://schemas.microsoft.com/office/drawing/2016/5/10/chartex" xmlns:cx5="http://schemas.microsoft.com/office/drawing/2016/5/11/chartex" xmlns:cx6="http://schemas.microsoft.com/office/drawing/2016/5/12/chartex" xmlns:cx7="http://schemas.microsoft.com/office/drawing/2016/5/13/chartex" xmlns:cx8="http://schemas.microsoft.com/office/drawing/2016/5/14/chartex" xmlns:mc="http://schemas.openxmlformats.org/markup-compatibility/2006" xmlns:aink="http://schemas.microsoft.com/office/drawing/2016/ink" xmlns:am3d="http://schemas.microsoft.com/office/drawing/2017/model3d" xmlns:o="urn:schemas-microsoft-com:office:office" xmlns:r="http://schemas.openxmlformats.org/officeDocument/2006/relationships" xmlns:m="http://schemas.openxmlformats.org/officeDocument/2006/math" xmlns:v="urn:schemas-microsoft-com:vml" xmlns:wp14="http://schemas.microsoft.com/office/word/2010/wordprocessingDrawing" xmlns:wp="http://schemas.openxmlformats.org/drawingml/2006/wordprocessingDrawing" xmlns:w10="urn:schemas-microsoft-com:office:word" xmlns:w="http://schemas.openxmlformats.org/wordprocessingml/2006/main" xmlns:w14="http://schemas.microsoft.com/office/word/2010/wordml" xmlns:w15="http://schemas.microsoft.com/office/word/2012/wordml" xmlns:w16cex="http://schemas.microsoft.com/office/word/2018/wordml/cex" xmlns:w16cid="http://schemas.microsoft.com/office/word/2016/wordml/cid" xmlns:w16="http://schemas.microsoft.com/office/word/2018/wordml" xmlns:w16sdtdh="http://schemas.microsoft.com/office/word/2020/wordml/sdtdatahash" xmlns:w16se="http://schemas.microsoft.com/office/word/2015/wordml/symex" xmlns:wpg="http://schemas.microsoft.com/office/word/2010/wordprocessingGroup" xmlns:wpi="http://schemas.microsoft.com/office/word/2010/wordprocessingInk" xmlns:wne="http://schemas.microsoft.com/office/word/2006/wordml" xmlns:wps="http://schemas.microsoft.com/office/word/2010/wordprocessingShape" mc:Ignorable="w14 w15 w16se w16cid w16 w16cex w16sdtdh wp14">
   <w:p>
     <w:pPr>
       <w:pStyle w:val="Footer"/>
@@ -496,8 +1300,33 @@
 </w:ftr>
 </file>
 
+<file path=word/footnotes.xml><?xml version="1.0" encoding="utf-8"?>
+<w:footnotes xmlns:wpc="http://schemas.microsoft.com/office/word/2010/wordprocessingCanvas" xmlns:cx="http://schemas.microsoft.com/office/drawing/2014/chartex" xmlns:cx1="http://schemas.microsoft.com/office/drawing/2015/9/8/chartex" xmlns:cx2="http://schemas.microsoft.com/office/drawing/2015/10/21/chartex" xmlns:cx3="http://schemas.microsoft.com/office/drawing/2016/5/9/chartex" xmlns:cx4="http://schemas.microsoft.com/office/drawing/2016/5/10/chartex" xmlns:cx5="http://schemas.microsoft.com/office/drawing/2016/5/11/chartex" xmlns:cx6="http://schemas.microsoft.com/office/drawing/2016/5/12/chartex" xmlns:cx7="http://schemas.microsoft.com/office/drawing/2016/5/13/chartex" xmlns:cx8="http://schemas.microsoft.com/office/drawing/2016/5/14/chartex" xmlns:mc="http://schemas.openxmlformats.org/markup-compatibility/2006" xmlns:aink="http://schemas.microsoft.com/office/drawing/2016/ink" xmlns:am3d="http://schemas.microsoft.com/office/drawing/2017/model3d" xmlns:o="urn:schemas-microsoft-com:office:office" xmlns:r="http://schemas.openxmlformats.org/officeDocument/2006/relationships" xmlns:m="http://schemas.openxmlformats.org/officeDocument/2006/math" xmlns:v="urn:schemas-microsoft-com:vml" xmlns:wp14="http://schemas.microsoft.com/office/word/2010/wordprocessingDrawing" xmlns:wp="http://schemas.openxmlformats.org/drawingml/2006/wordprocessingDrawing" xmlns:w10="urn:schemas-microsoft-com:office:word" xmlns:w="http://schemas.openxmlformats.org/wordprocessingml/2006/main" xmlns:w14="http://schemas.microsoft.com/office/word/2010/wordml" xmlns:w15="http://schemas.microsoft.com/office/word/2012/wordml" xmlns:w16cex="http://schemas.microsoft.com/office/word/2018/wordml/cex" xmlns:w16cid="http://schemas.microsoft.com/office/word/2016/wordml/cid" xmlns:w16="http://schemas.microsoft.com/office/word/2018/wordml" xmlns:w16sdtdh="http://schemas.microsoft.com/office/word/2020/wordml/sdtdatahash" xmlns:w16se="http://schemas.microsoft.com/office/word/2015/wordml/symex" xmlns:wpg="http://schemas.microsoft.com/office/word/2010/wordprocessingGroup" xmlns:wpi="http://schemas.microsoft.com/office/word/2010/wordprocessingInk" xmlns:wne="http://schemas.microsoft.com/office/word/2006/wordml" xmlns:wps="http://schemas.microsoft.com/office/word/2010/wordprocessingShape" mc:Ignorable="w14 w15 w16se w16cid w16 w16cex w16sdtdh wp14">
+  <w:footnote w:type="separator" w:id="-1">
+    <w:p>
+      <w:pPr>
+        <w:spacing w:before="0" w:after="0"/>
+      </w:pPr>
+      <w:r>
+        <w:separator/>
+      </w:r>
+    </w:p>
+  </w:footnote>
+  <w:footnote w:type="continuationSeparator" w:id="0">
+    <w:p>
+      <w:pPr>
+        <w:spacing w:before="0" w:after="0"/>
+      </w:pPr>
+      <w:r>
+        <w:continuationSeparator/>
+      </w:r>
+    </w:p>
+  </w:footnote>
+</w:footnotes>
+</file>
+
 <file path=word/header1.xml><?xml version="1.0" encoding="utf-8"?>
-<w:hdr xmlns:m="http://schemas.openxmlformats.org/officeDocument/2006/math" xmlns:mc="http://schemas.openxmlformats.org/markup-compatibility/2006" xmlns:mo="http://schemas.microsoft.com/office/mac/office/2008/main" xmlns:mv="urn:schemas-microsoft-com:mac:vml" xmlns:o="urn:schemas-microsoft-com:office:office" xmlns:r="http://schemas.openxmlformats.org/officeDocument/2006/relationships" xmlns:v="urn:schemas-microsoft-com:vml" xmlns:w10="urn:schemas-microsoft-com:office:word" xmlns:w14="http://schemas.microsoft.com/office/word/2010/wordml" xmlns:w="http://schemas.openxmlformats.org/wordprocessingml/2006/main" xmlns:wne="http://schemas.microsoft.com/office/word/2006/wordml" xmlns:wp14="http://schemas.microsoft.com/office/word/2010/wordprocessingDrawing" xmlns:wp="http://schemas.openxmlformats.org/drawingml/2006/wordprocessingDrawing" xmlns:wpc="http://schemas.microsoft.com/office/word/2010/wordprocessingCanvas" xmlns:wpg="http://schemas.microsoft.com/office/word/2010/wordprocessingGroup" xmlns:wpi="http://schemas.microsoft.com/office/word/2010/wordprocessingInk" xmlns:wps="http://schemas.microsoft.com/office/word/2010/wordprocessingShape" mc:Ignorable="w14 wp14">
+<w:hdr xmlns:wpc="http://schemas.microsoft.com/office/word/2010/wordprocessingCanvas" xmlns:cx="http://schemas.microsoft.com/office/drawing/2014/chartex" xmlns:cx1="http://schemas.microsoft.com/office/drawing/2015/9/8/chartex" xmlns:cx2="http://schemas.microsoft.com/office/drawing/2015/10/21/chartex" xmlns:cx3="http://schemas.microsoft.com/office/drawing/2016/5/9/chartex" xmlns:cx4="http://schemas.microsoft.com/office/drawing/2016/5/10/chartex" xmlns:cx5="http://schemas.microsoft.com/office/drawing/2016/5/11/chartex" xmlns:cx6="http://schemas.microsoft.com/office/drawing/2016/5/12/chartex" xmlns:cx7="http://schemas.microsoft.com/office/drawing/2016/5/13/chartex" xmlns:cx8="http://schemas.microsoft.com/office/drawing/2016/5/14/chartex" xmlns:mc="http://schemas.openxmlformats.org/markup-compatibility/2006" xmlns:aink="http://schemas.microsoft.com/office/drawing/2016/ink" xmlns:am3d="http://schemas.microsoft.com/office/drawing/2017/model3d" xmlns:o="urn:schemas-microsoft-com:office:office" xmlns:r="http://schemas.openxmlformats.org/officeDocument/2006/relationships" xmlns:m="http://schemas.openxmlformats.org/officeDocument/2006/math" xmlns:v="urn:schemas-microsoft-com:vml" xmlns:wp14="http://schemas.microsoft.com/office/word/2010/wordprocessingDrawing" xmlns:wp="http://schemas.openxmlformats.org/drawingml/2006/wordprocessingDrawing" xmlns:w10="urn:schemas-microsoft-com:office:word" xmlns:w="http://schemas.openxmlformats.org/wordprocessingml/2006/main" xmlns:w14="http://schemas.microsoft.com/office/word/2010/wordml" xmlns:w15="http://schemas.microsoft.com/office/word/2012/wordml" xmlns:w16cex="http://schemas.microsoft.com/office/word/2018/wordml/cex" xmlns:w16cid="http://schemas.microsoft.com/office/word/2016/wordml/cid" xmlns:w16="http://schemas.microsoft.com/office/word/2018/wordml" xmlns:w16sdtdh="http://schemas.microsoft.com/office/word/2020/wordml/sdtdatahash" xmlns:w16se="http://schemas.microsoft.com/office/word/2015/wordml/symex" xmlns:wpg="http://schemas.microsoft.com/office/word/2010/wordprocessingGroup" xmlns:wpi="http://schemas.microsoft.com/office/word/2010/wordprocessingInk" xmlns:wne="http://schemas.microsoft.com/office/word/2006/wordml" xmlns:wps="http://schemas.microsoft.com/office/word/2010/wordprocessingShape" mc:Ignorable="w14 w15 w16se w16cid w16 w16cex w16sdtdh wp14">
   <w:p>
     <w:pPr>
       <w:pStyle w:val="Header"/>
@@ -507,7 +1336,7 @@
 </file>
 
 <file path=word/header2.xml><?xml version="1.0" encoding="utf-8"?>
-<w:hdr xmlns:m="http://schemas.openxmlformats.org/officeDocument/2006/math" xmlns:mc="http://schemas.openxmlformats.org/markup-compatibility/2006" xmlns:mo="http://schemas.microsoft.com/office/mac/office/2008/main" xmlns:mv="urn:schemas-microsoft-com:mac:vml" xmlns:o="urn:schemas-microsoft-com:office:office" xmlns:r="http://schemas.openxmlformats.org/officeDocument/2006/relationships" xmlns:v="urn:schemas-microsoft-com:vml" xmlns:w10="urn:schemas-microsoft-com:office:word" xmlns:w14="http://schemas.microsoft.com/office/word/2010/wordml" xmlns:w="http://schemas.openxmlformats.org/wordprocessingml/2006/main" xmlns:wne="http://schemas.microsoft.com/office/word/2006/wordml" xmlns:wp14="http://schemas.microsoft.com/office/word/2010/wordprocessingDrawing" xmlns:wp="http://schemas.openxmlformats.org/drawingml/2006/wordprocessingDrawing" xmlns:wpc="http://schemas.microsoft.com/office/word/2010/wordprocessingCanvas" xmlns:wpg="http://schemas.microsoft.com/office/word/2010/wordprocessingGroup" xmlns:wpi="http://schemas.microsoft.com/office/word/2010/wordprocessingInk" xmlns:wps="http://schemas.microsoft.com/office/word/2010/wordprocessingShape" mc:Ignorable="w14 wp14">
+<w:hdr xmlns:wpc="http://schemas.microsoft.com/office/word/2010/wordprocessingCanvas" xmlns:cx="http://schemas.microsoft.com/office/drawing/2014/chartex" xmlns:cx1="http://schemas.microsoft.com/office/drawing/2015/9/8/chartex" xmlns:cx2="http://schemas.microsoft.com/office/drawing/2015/10/21/chartex" xmlns:cx3="http://schemas.microsoft.com/office/drawing/2016/5/9/chartex" xmlns:cx4="http://schemas.microsoft.com/office/drawing/2016/5/10/chartex" xmlns:cx5="http://schemas.microsoft.com/office/drawing/2016/5/11/chartex" xmlns:cx6="http://schemas.microsoft.com/office/drawing/2016/5/12/chartex" xmlns:cx7="http://schemas.microsoft.com/office/drawing/2016/5/13/chartex" xmlns:cx8="http://schemas.microsoft.com/office/drawing/2016/5/14/chartex" xmlns:mc="http://schemas.openxmlformats.org/markup-compatibility/2006" xmlns:aink="http://schemas.microsoft.com/office/drawing/2016/ink" xmlns:am3d="http://schemas.microsoft.com/office/drawing/2017/model3d" xmlns:o="urn:schemas-microsoft-com:office:office" xmlns:r="http://schemas.openxmlformats.org/officeDocument/2006/relationships" xmlns:m="http://schemas.openxmlformats.org/officeDocument/2006/math" xmlns:v="urn:schemas-microsoft-com:vml" xmlns:wp14="http://schemas.microsoft.com/office/word/2010/wordprocessingDrawing" xmlns:wp="http://schemas.openxmlformats.org/drawingml/2006/wordprocessingDrawing" xmlns:w10="urn:schemas-microsoft-com:office:word" xmlns:w="http://schemas.openxmlformats.org/wordprocessingml/2006/main" xmlns:w14="http://schemas.microsoft.com/office/word/2010/wordml" xmlns:w15="http://schemas.microsoft.com/office/word/2012/wordml" xmlns:w16cex="http://schemas.microsoft.com/office/word/2018/wordml/cex" xmlns:w16cid="http://schemas.microsoft.com/office/word/2016/wordml/cid" xmlns:w16="http://schemas.microsoft.com/office/word/2018/wordml" xmlns:w16sdtdh="http://schemas.microsoft.com/office/word/2020/wordml/sdtdatahash" xmlns:w16se="http://schemas.microsoft.com/office/word/2015/wordml/symex" xmlns:wpg="http://schemas.microsoft.com/office/word/2010/wordprocessingGroup" xmlns:wpi="http://schemas.microsoft.com/office/word/2010/wordprocessingInk" xmlns:wne="http://schemas.microsoft.com/office/word/2006/wordml" xmlns:wps="http://schemas.microsoft.com/office/word/2010/wordprocessingShape" mc:Ignorable="w14 w15 w16se w16cid w16 w16cex w16sdtdh wp14">
   <w:p>
     <w:pPr>
       <w:pStyle w:val="Header"/>
@@ -517,7 +1346,7 @@
 </file>
 
 <file path=word/header3.xml><?xml version="1.0" encoding="utf-8"?>
-<w:hdr xmlns:m="http://schemas.openxmlformats.org/officeDocument/2006/math" xmlns:mc="http://schemas.openxmlformats.org/markup-compatibility/2006" xmlns:mo="http://schemas.microsoft.com/office/mac/office/2008/main" xmlns:mv="urn:schemas-microsoft-com:mac:vml" xmlns:o="urn:schemas-microsoft-com:office:office" xmlns:r="http://schemas.openxmlformats.org/officeDocument/2006/relationships" xmlns:v="urn:schemas-microsoft-com:vml" xmlns:w10="urn:schemas-microsoft-com:office:word" xmlns:w14="http://schemas.microsoft.com/office/word/2010/wordml" xmlns:w="http://schemas.openxmlformats.org/wordprocessingml/2006/main" xmlns:wne="http://schemas.microsoft.com/office/word/2006/wordml" xmlns:wp14="http://schemas.microsoft.com/office/word/2010/wordprocessingDrawing" xmlns:wp="http://schemas.openxmlformats.org/drawingml/2006/wordprocessingDrawing" xmlns:wpc="http://schemas.microsoft.com/office/word/2010/wordprocessingCanvas" xmlns:wpg="http://schemas.microsoft.com/office/word/2010/wordprocessingGroup" xmlns:wpi="http://schemas.microsoft.com/office/word/2010/wordprocessingInk" xmlns:wps="http://schemas.microsoft.com/office/word/2010/wordprocessingShape" mc:Ignorable="w14 wp14">
+<w:hdr xmlns:wpc="http://schemas.microsoft.com/office/word/2010/wordprocessingCanvas" xmlns:cx="http://schemas.microsoft.com/office/drawing/2014/chartex" xmlns:cx1="http://schemas.microsoft.com/office/drawing/2015/9/8/chartex" xmlns:cx2="http://schemas.microsoft.com/office/drawing/2015/10/21/chartex" xmlns:cx3="http://schemas.microsoft.com/office/drawing/2016/5/9/chartex" xmlns:cx4="http://schemas.microsoft.com/office/drawing/2016/5/10/chartex" xmlns:cx5="http://schemas.microsoft.com/office/drawing/2016/5/11/chartex" xmlns:cx6="http://schemas.microsoft.com/office/drawing/2016/5/12/chartex" xmlns:cx7="http://schemas.microsoft.com/office/drawing/2016/5/13/chartex" xmlns:cx8="http://schemas.microsoft.com/office/drawing/2016/5/14/chartex" xmlns:mc="http://schemas.openxmlformats.org/markup-compatibility/2006" xmlns:aink="http://schemas.microsoft.com/office/drawing/2016/ink" xmlns:am3d="http://schemas.microsoft.com/office/drawing/2017/model3d" xmlns:o="urn:schemas-microsoft-com:office:office" xmlns:r="http://schemas.openxmlformats.org/officeDocument/2006/relationships" xmlns:m="http://schemas.openxmlformats.org/officeDocument/2006/math" xmlns:v="urn:schemas-microsoft-com:vml" xmlns:wp14="http://schemas.microsoft.com/office/word/2010/wordprocessingDrawing" xmlns:wp="http://schemas.openxmlformats.org/drawingml/2006/wordprocessingDrawing" xmlns:w10="urn:schemas-microsoft-com:office:word" xmlns:w="http://schemas.openxmlformats.org/wordprocessingml/2006/main" xmlns:w14="http://schemas.microsoft.com/office/word/2010/wordml" xmlns:w15="http://schemas.microsoft.com/office/word/2012/wordml" xmlns:w16cex="http://schemas.microsoft.com/office/word/2018/wordml/cex" xmlns:w16cid="http://schemas.microsoft.com/office/word/2016/wordml/cid" xmlns:w16="http://schemas.microsoft.com/office/word/2018/wordml" xmlns:w16sdtdh="http://schemas.microsoft.com/office/word/2020/wordml/sdtdatahash" xmlns:w16se="http://schemas.microsoft.com/office/word/2015/wordml/symex" xmlns:wpg="http://schemas.microsoft.com/office/word/2010/wordprocessingGroup" xmlns:wpi="http://schemas.microsoft.com/office/word/2010/wordprocessingInk" xmlns:wne="http://schemas.microsoft.com/office/word/2006/wordml" xmlns:wps="http://schemas.microsoft.com/office/word/2010/wordprocessingShape" mc:Ignorable="w14 w15 w16se w16cid w16 w16cex w16sdtdh wp14">
   <w:p>
     <w:pPr>
       <w:pStyle w:val="Header"/>
@@ -529,6 +1358,119 @@
 <file path=word/numbering.xml><?xml version="1.0" encoding="utf-8"?>
 <w:numbering xmlns:wpc="http://schemas.microsoft.com/office/word/2010/wordprocessingCanvas" xmlns:cx="http://schemas.microsoft.com/office/drawing/2014/chartex" xmlns:cx1="http://schemas.microsoft.com/office/drawing/2015/9/8/chartex" xmlns:cx2="http://schemas.microsoft.com/office/drawing/2015/10/21/chartex" xmlns:cx3="http://schemas.microsoft.com/office/drawing/2016/5/9/chartex" xmlns:cx4="http://schemas.microsoft.com/office/drawing/2016/5/10/chartex" xmlns:cx5="http://schemas.microsoft.com/office/drawing/2016/5/11/chartex" xmlns:cx6="http://schemas.microsoft.com/office/drawing/2016/5/12/chartex" xmlns:cx7="http://schemas.microsoft.com/office/drawing/2016/5/13/chartex" xmlns:cx8="http://schemas.microsoft.com/office/drawing/2016/5/14/chartex" xmlns:mc="http://schemas.openxmlformats.org/markup-compatibility/2006" xmlns:aink="http://schemas.microsoft.com/office/drawing/2016/ink" xmlns:am3d="http://schemas.microsoft.com/office/drawing/2017/model3d" xmlns:o="urn:schemas-microsoft-com:office:office" xmlns:r="http://schemas.openxmlformats.org/officeDocument/2006/relationships" xmlns:m="http://schemas.openxmlformats.org/officeDocument/2006/math" xmlns:v="urn:schemas-microsoft-com:vml" xmlns:wp14="http://schemas.microsoft.com/office/word/2010/wordprocessingDrawing" xmlns:wp="http://schemas.openxmlformats.org/drawingml/2006/wordprocessingDrawing" xmlns:w10="urn:schemas-microsoft-com:office:word" xmlns:w="http://schemas.openxmlformats.org/wordprocessingml/2006/main" xmlns:w14="http://schemas.microsoft.com/office/word/2010/wordml" xmlns:w15="http://schemas.microsoft.com/office/word/2012/wordml" xmlns:w16cex="http://schemas.microsoft.com/office/word/2018/wordml/cex" xmlns:w16cid="http://schemas.microsoft.com/office/word/2016/wordml/cid" xmlns:w16="http://schemas.microsoft.com/office/word/2018/wordml" xmlns:w16sdtdh="http://schemas.microsoft.com/office/word/2020/wordml/sdtdatahash" xmlns:w16se="http://schemas.microsoft.com/office/word/2015/wordml/symex" xmlns:wpg="http://schemas.microsoft.com/office/word/2010/wordprocessingGroup" xmlns:wpi="http://schemas.microsoft.com/office/word/2010/wordprocessingInk" xmlns:wne="http://schemas.microsoft.com/office/word/2006/wordml" xmlns:wps="http://schemas.microsoft.com/office/word/2010/wordprocessingShape" mc:Ignorable="w14 w15 w16se w16cid w16 w16cex w16sdtdh wp14">
   <w:abstractNum w:abstractNumId="0" w15:restartNumberingAfterBreak="0">
+    <w:nsid w:val="01F54986"/>
+    <w:multiLevelType w:val="hybridMultilevel"/>
+    <w:tmpl w:val="C0BA1842"/>
+    <w:lvl w:ilvl="0" w:tplc="04090001">
+      <w:start w:val="1"/>
+      <w:numFmt w:val="bullet"/>
+      <w:lvlText w:val=""/>
+      <w:lvlJc w:val="left"/>
+      <w:pPr>
+        <w:ind w:left="720" w:hanging="360"/>
+      </w:pPr>
+      <w:rPr>
+        <w:rFonts w:ascii="Symbol" w:hAnsi="Symbol" w:hint="default"/>
+      </w:rPr>
+    </w:lvl>
+    <w:lvl w:ilvl="1" w:tplc="04090003" w:tentative="1">
+      <w:start w:val="1"/>
+      <w:numFmt w:val="bullet"/>
+      <w:lvlText w:val="o"/>
+      <w:lvlJc w:val="left"/>
+      <w:pPr>
+        <w:ind w:left="1440" w:hanging="360"/>
+      </w:pPr>
+      <w:rPr>
+        <w:rFonts w:ascii="Courier New" w:hAnsi="Courier New" w:cs="Courier New" w:hint="default"/>
+      </w:rPr>
+    </w:lvl>
+    <w:lvl w:ilvl="2" w:tplc="04090005" w:tentative="1">
+      <w:start w:val="1"/>
+      <w:numFmt w:val="bullet"/>
+      <w:lvlText w:val=""/>
+      <w:lvlJc w:val="left"/>
+      <w:pPr>
+        <w:ind w:left="2160" w:hanging="360"/>
+      </w:pPr>
+      <w:rPr>
+        <w:rFonts w:ascii="Wingdings" w:hAnsi="Wingdings" w:hint="default"/>
+      </w:rPr>
+    </w:lvl>
+    <w:lvl w:ilvl="3" w:tplc="04090001" w:tentative="1">
+      <w:start w:val="1"/>
+      <w:numFmt w:val="bullet"/>
+      <w:lvlText w:val=""/>
+      <w:lvlJc w:val="left"/>
+      <w:pPr>
+        <w:ind w:left="2880" w:hanging="360"/>
+      </w:pPr>
+      <w:rPr>
+        <w:rFonts w:ascii="Symbol" w:hAnsi="Symbol" w:hint="default"/>
+      </w:rPr>
+    </w:lvl>
+    <w:lvl w:ilvl="4" w:tplc="04090003" w:tentative="1">
+      <w:start w:val="1"/>
+      <w:numFmt w:val="bullet"/>
+      <w:lvlText w:val="o"/>
+      <w:lvlJc w:val="left"/>
+      <w:pPr>
+        <w:ind w:left="3600" w:hanging="360"/>
+      </w:pPr>
+      <w:rPr>
+        <w:rFonts w:ascii="Courier New" w:hAnsi="Courier New" w:cs="Courier New" w:hint="default"/>
+      </w:rPr>
+    </w:lvl>
+    <w:lvl w:ilvl="5" w:tplc="04090005" w:tentative="1">
+      <w:start w:val="1"/>
+      <w:numFmt w:val="bullet"/>
+      <w:lvlText w:val=""/>
+      <w:lvlJc w:val="left"/>
+      <w:pPr>
+        <w:ind w:left="4320" w:hanging="360"/>
+      </w:pPr>
+      <w:rPr>
+        <w:rFonts w:ascii="Wingdings" w:hAnsi="Wingdings" w:hint="default"/>
+      </w:rPr>
+    </w:lvl>
+    <w:lvl w:ilvl="6" w:tplc="04090001" w:tentative="1">
+      <w:start w:val="1"/>
+      <w:numFmt w:val="bullet"/>
+      <w:lvlText w:val=""/>
+      <w:lvlJc w:val="left"/>
+      <w:pPr>
+        <w:ind w:left="5040" w:hanging="360"/>
+      </w:pPr>
+      <w:rPr>
+        <w:rFonts w:ascii="Symbol" w:hAnsi="Symbol" w:hint="default"/>
+      </w:rPr>
+    </w:lvl>
+    <w:lvl w:ilvl="7" w:tplc="04090003" w:tentative="1">
+      <w:start w:val="1"/>
+      <w:numFmt w:val="bullet"/>
+      <w:lvlText w:val="o"/>
+      <w:lvlJc w:val="left"/>
+      <w:pPr>
+        <w:ind w:left="5760" w:hanging="360"/>
+      </w:pPr>
+      <w:rPr>
+        <w:rFonts w:ascii="Courier New" w:hAnsi="Courier New" w:cs="Courier New" w:hint="default"/>
+      </w:rPr>
+    </w:lvl>
+    <w:lvl w:ilvl="8" w:tplc="04090005" w:tentative="1">
+      <w:start w:val="1"/>
+      <w:numFmt w:val="bullet"/>
+      <w:lvlText w:val=""/>
+      <w:lvlJc w:val="left"/>
+      <w:pPr>
+        <w:ind w:left="6480" w:hanging="360"/>
+      </w:pPr>
+      <w:rPr>
+        <w:rFonts w:ascii="Wingdings" w:hAnsi="Wingdings" w:hint="default"/>
+      </w:rPr>
+    </w:lvl>
+  </w:abstractNum>
+  <w:abstractNum w:abstractNumId="1" w15:restartNumberingAfterBreak="0">
     <w:nsid w:val="08C6366F"/>
     <w:multiLevelType w:val="hybridMultilevel"/>
     <w:tmpl w:val="D3561CAA"/>
@@ -615,7 +1557,7 @@
       </w:pPr>
     </w:lvl>
   </w:abstractNum>
-  <w:abstractNum w:abstractNumId="1" w15:restartNumberingAfterBreak="0">
+  <w:abstractNum w:abstractNumId="2" w15:restartNumberingAfterBreak="0">
     <w:nsid w:val="0C357DD6"/>
     <w:multiLevelType w:val="hybridMultilevel"/>
     <w:tmpl w:val="D83AD7E4"/>
@@ -706,7 +1648,7 @@
       </w:pPr>
     </w:lvl>
   </w:abstractNum>
-  <w:abstractNum w:abstractNumId="2" w15:restartNumberingAfterBreak="0">
+  <w:abstractNum w:abstractNumId="3" w15:restartNumberingAfterBreak="0">
     <w:nsid w:val="0DEA069D"/>
     <w:multiLevelType w:val="multilevel"/>
     <w:tmpl w:val="450C4EF6"/>
@@ -847,7 +1789,7 @@
       </w:rPr>
     </w:lvl>
   </w:abstractNum>
-  <w:abstractNum w:abstractNumId="3" w15:restartNumberingAfterBreak="0">
+  <w:abstractNum w:abstractNumId="4" w15:restartNumberingAfterBreak="0">
     <w:nsid w:val="0EF336F1"/>
     <w:multiLevelType w:val="hybridMultilevel"/>
     <w:tmpl w:val="F80A238A"/>
@@ -960,7 +1902,7 @@
       </w:rPr>
     </w:lvl>
   </w:abstractNum>
-  <w:abstractNum w:abstractNumId="4" w15:restartNumberingAfterBreak="0">
+  <w:abstractNum w:abstractNumId="5" w15:restartNumberingAfterBreak="0">
     <w:nsid w:val="11F921E4"/>
     <w:multiLevelType w:val="hybridMultilevel"/>
     <w:tmpl w:val="ADFC1EC2"/>
@@ -1072,7 +2014,7 @@
       </w:rPr>
     </w:lvl>
   </w:abstractNum>
-  <w:abstractNum w:abstractNumId="5" w15:restartNumberingAfterBreak="0">
+  <w:abstractNum w:abstractNumId="6" w15:restartNumberingAfterBreak="0">
     <w:nsid w:val="1323523E"/>
     <w:multiLevelType w:val="multilevel"/>
     <w:tmpl w:val="873C83DA"/>
@@ -1229,7 +2171,7 @@
       </w:rPr>
     </w:lvl>
   </w:abstractNum>
-  <w:abstractNum w:abstractNumId="6" w15:restartNumberingAfterBreak="0">
+  <w:abstractNum w:abstractNumId="7" w15:restartNumberingAfterBreak="0">
     <w:nsid w:val="15510218"/>
     <w:multiLevelType w:val="hybridMultilevel"/>
     <w:tmpl w:val="8EF49D20"/>
@@ -1319,7 +2261,7 @@
       </w:pPr>
     </w:lvl>
   </w:abstractNum>
-  <w:abstractNum w:abstractNumId="7" w15:restartNumberingAfterBreak="0">
+  <w:abstractNum w:abstractNumId="8" w15:restartNumberingAfterBreak="0">
     <w:nsid w:val="1D4A52C2"/>
     <w:multiLevelType w:val="hybridMultilevel"/>
     <w:tmpl w:val="60122282"/>
@@ -1431,7 +2373,7 @@
       </w:rPr>
     </w:lvl>
   </w:abstractNum>
-  <w:abstractNum w:abstractNumId="8" w15:restartNumberingAfterBreak="0">
+  <w:abstractNum w:abstractNumId="9" w15:restartNumberingAfterBreak="0">
     <w:nsid w:val="20FD4BF5"/>
     <w:multiLevelType w:val="hybridMultilevel"/>
     <w:tmpl w:val="6EC27A36"/>
@@ -1544,7 +2486,7 @@
       </w:rPr>
     </w:lvl>
   </w:abstractNum>
-  <w:abstractNum w:abstractNumId="9" w15:restartNumberingAfterBreak="0">
+  <w:abstractNum w:abstractNumId="10" w15:restartNumberingAfterBreak="0">
     <w:nsid w:val="253D4794"/>
     <w:multiLevelType w:val="multilevel"/>
     <w:tmpl w:val="8C80AB36"/>
@@ -1657,7 +2599,7 @@
       </w:rPr>
     </w:lvl>
   </w:abstractNum>
-  <w:abstractNum w:abstractNumId="10" w15:restartNumberingAfterBreak="0">
+  <w:abstractNum w:abstractNumId="11" w15:restartNumberingAfterBreak="0">
     <w:nsid w:val="27FF20A5"/>
     <w:multiLevelType w:val="hybridMultilevel"/>
     <w:tmpl w:val="9036D3D8"/>
@@ -1772,7 +2714,7 @@
       </w:rPr>
     </w:lvl>
   </w:abstractNum>
-  <w:abstractNum w:abstractNumId="11" w15:restartNumberingAfterBreak="0">
+  <w:abstractNum w:abstractNumId="12" w15:restartNumberingAfterBreak="0">
     <w:nsid w:val="296F3872"/>
     <w:multiLevelType w:val="hybridMultilevel"/>
     <w:tmpl w:val="5E9E6A2E"/>
@@ -1886,7 +2828,7 @@
       </w:rPr>
     </w:lvl>
   </w:abstractNum>
-  <w:abstractNum w:abstractNumId="12" w15:restartNumberingAfterBreak="0">
+  <w:abstractNum w:abstractNumId="13" w15:restartNumberingAfterBreak="0">
     <w:nsid w:val="416740F3"/>
     <w:multiLevelType w:val="hybridMultilevel"/>
     <w:tmpl w:val="F012AB78"/>
@@ -1999,7 +2941,7 @@
       </w:rPr>
     </w:lvl>
   </w:abstractNum>
-  <w:abstractNum w:abstractNumId="13" w15:restartNumberingAfterBreak="0">
+  <w:abstractNum w:abstractNumId="14" w15:restartNumberingAfterBreak="0">
     <w:nsid w:val="4803540D"/>
     <w:multiLevelType w:val="hybridMultilevel"/>
     <w:tmpl w:val="CC58063A"/>
@@ -2113,7 +3055,7 @@
       </w:rPr>
     </w:lvl>
   </w:abstractNum>
-  <w:abstractNum w:abstractNumId="14" w15:restartNumberingAfterBreak="0">
+  <w:abstractNum w:abstractNumId="15" w15:restartNumberingAfterBreak="0">
     <w:nsid w:val="492F4D8F"/>
     <w:multiLevelType w:val="hybridMultilevel"/>
     <w:tmpl w:val="F62C94DE"/>
@@ -2227,7 +3169,7 @@
       </w:rPr>
     </w:lvl>
   </w:abstractNum>
-  <w:abstractNum w:abstractNumId="15" w15:restartNumberingAfterBreak="0">
+  <w:abstractNum w:abstractNumId="16" w15:restartNumberingAfterBreak="0">
     <w:nsid w:val="5A0B13C4"/>
     <w:multiLevelType w:val="hybridMultilevel"/>
     <w:tmpl w:val="E84E7C10"/>
@@ -2340,7 +3282,7 @@
       </w:rPr>
     </w:lvl>
   </w:abstractNum>
-  <w:abstractNum w:abstractNumId="16" w15:restartNumberingAfterBreak="0">
+  <w:abstractNum w:abstractNumId="17" w15:restartNumberingAfterBreak="0">
     <w:nsid w:val="5FA755C2"/>
     <w:multiLevelType w:val="hybridMultilevel"/>
     <w:tmpl w:val="8C5878DA"/>
@@ -2453,7 +3395,7 @@
       </w:rPr>
     </w:lvl>
   </w:abstractNum>
-  <w:abstractNum w:abstractNumId="17" w15:restartNumberingAfterBreak="0">
+  <w:abstractNum w:abstractNumId="18" w15:restartNumberingAfterBreak="0">
     <w:nsid w:val="636B498A"/>
     <w:multiLevelType w:val="hybridMultilevel"/>
     <w:tmpl w:val="1032CF60"/>
@@ -2566,7 +3508,7 @@
       </w:rPr>
     </w:lvl>
   </w:abstractNum>
-  <w:abstractNum w:abstractNumId="18" w15:restartNumberingAfterBreak="0">
+  <w:abstractNum w:abstractNumId="19" w15:restartNumberingAfterBreak="0">
     <w:nsid w:val="657F013F"/>
     <w:multiLevelType w:val="hybridMultilevel"/>
     <w:tmpl w:val="E61C807C"/>
@@ -2679,7 +3621,7 @@
       </w:rPr>
     </w:lvl>
   </w:abstractNum>
-  <w:abstractNum w:abstractNumId="19" w15:restartNumberingAfterBreak="0">
+  <w:abstractNum w:abstractNumId="20" w15:restartNumberingAfterBreak="0">
     <w:nsid w:val="6B961852"/>
     <w:multiLevelType w:val="hybridMultilevel"/>
     <w:tmpl w:val="DAAECE10"/>
@@ -2773,142 +3715,145 @@
     </w:lvl>
   </w:abstractNum>
   <w:num w:numId="1">
+    <w:abstractNumId w:val="16"/>
+  </w:num>
+  <w:num w:numId="2">
+    <w:abstractNumId w:val="16"/>
+  </w:num>
+  <w:num w:numId="3">
+    <w:abstractNumId w:val="16"/>
+  </w:num>
+  <w:num w:numId="4">
+    <w:abstractNumId w:val="7"/>
+  </w:num>
+  <w:num w:numId="5">
+    <w:abstractNumId w:val="2"/>
+  </w:num>
+  <w:num w:numId="6">
+    <w:abstractNumId w:val="6"/>
+  </w:num>
+  <w:num w:numId="7">
+    <w:abstractNumId w:val="12"/>
+  </w:num>
+  <w:num w:numId="8">
+    <w:abstractNumId w:val="12"/>
+  </w:num>
+  <w:num w:numId="9">
+    <w:abstractNumId w:val="12"/>
+  </w:num>
+  <w:num w:numId="10">
+    <w:abstractNumId w:val="2"/>
+  </w:num>
+  <w:num w:numId="11">
+    <w:abstractNumId w:val="11"/>
+  </w:num>
+  <w:num w:numId="12">
+    <w:abstractNumId w:val="3"/>
+  </w:num>
+  <w:num w:numId="13">
+    <w:abstractNumId w:val="20"/>
+  </w:num>
+  <w:num w:numId="14">
     <w:abstractNumId w:val="15"/>
   </w:num>
-  <w:num w:numId="2">
+  <w:num w:numId="15">
+    <w:abstractNumId w:val="14"/>
+  </w:num>
+  <w:num w:numId="16">
+    <w:abstractNumId w:val="1"/>
+  </w:num>
+  <w:num w:numId="17">
+    <w:abstractNumId w:val="10"/>
+  </w:num>
+  <w:num w:numId="18">
+    <w:abstractNumId w:val="12"/>
+  </w:num>
+  <w:num w:numId="19">
+    <w:abstractNumId w:val="11"/>
+  </w:num>
+  <w:num w:numId="20">
+    <w:abstractNumId w:val="3"/>
+  </w:num>
+  <w:num w:numId="21">
+    <w:abstractNumId w:val="20"/>
+  </w:num>
+  <w:num w:numId="22">
     <w:abstractNumId w:val="15"/>
   </w:num>
-  <w:num w:numId="3">
+  <w:num w:numId="23">
+    <w:abstractNumId w:val="14"/>
+  </w:num>
+  <w:num w:numId="24">
+    <w:abstractNumId w:val="1"/>
+  </w:num>
+  <w:num w:numId="25">
+    <w:abstractNumId w:val="2"/>
+  </w:num>
+  <w:num w:numId="26">
+    <w:abstractNumId w:val="10"/>
+  </w:num>
+  <w:num w:numId="27">
+    <w:abstractNumId w:val="7"/>
+  </w:num>
+  <w:num w:numId="28">
+    <w:abstractNumId w:val="3"/>
+  </w:num>
+  <w:num w:numId="29">
+    <w:abstractNumId w:val="20"/>
+  </w:num>
+  <w:num w:numId="30">
+    <w:abstractNumId w:val="12"/>
+  </w:num>
+  <w:num w:numId="31">
     <w:abstractNumId w:val="15"/>
   </w:num>
-  <w:num w:numId="4">
-    <w:abstractNumId w:val="6"/>
+  <w:num w:numId="32">
+    <w:abstractNumId w:val="14"/>
   </w:num>
-  <w:num w:numId="5">
+  <w:num w:numId="33">
     <w:abstractNumId w:val="1"/>
   </w:num>
-  <w:num w:numId="6">
+  <w:num w:numId="34">
+    <w:abstractNumId w:val="12"/>
+  </w:num>
+  <w:num w:numId="35">
+    <w:abstractNumId w:val="12"/>
+  </w:num>
+  <w:num w:numId="36">
+    <w:abstractNumId w:val="2"/>
+  </w:num>
+  <w:num w:numId="37">
+    <w:abstractNumId w:val="10"/>
+  </w:num>
+  <w:num w:numId="38">
+    <w:abstractNumId w:val="7"/>
+  </w:num>
+  <w:num w:numId="39">
+    <w:abstractNumId w:val="13"/>
+  </w:num>
+  <w:num w:numId="40">
+    <w:abstractNumId w:val="18"/>
+  </w:num>
+  <w:num w:numId="41">
+    <w:abstractNumId w:val="19"/>
+  </w:num>
+  <w:num w:numId="42">
+    <w:abstractNumId w:val="8"/>
+  </w:num>
+  <w:num w:numId="43">
+    <w:abstractNumId w:val="4"/>
+  </w:num>
+  <w:num w:numId="44">
     <w:abstractNumId w:val="5"/>
   </w:num>
-  <w:num w:numId="7">
-    <w:abstractNumId w:val="11"/>
-  </w:num>
-  <w:num w:numId="8">
-    <w:abstractNumId w:val="11"/>
-  </w:num>
-  <w:num w:numId="9">
-    <w:abstractNumId w:val="11"/>
-  </w:num>
-  <w:num w:numId="10">
-    <w:abstractNumId w:val="1"/>
-  </w:num>
-  <w:num w:numId="11">
-    <w:abstractNumId w:val="10"/>
-  </w:num>
-  <w:num w:numId="12">
-    <w:abstractNumId w:val="2"/>
-  </w:num>
-  <w:num w:numId="13">
-    <w:abstractNumId w:val="19"/>
-  </w:num>
-  <w:num w:numId="14">
-    <w:abstractNumId w:val="14"/>
-  </w:num>
-  <w:num w:numId="15">
-    <w:abstractNumId w:val="13"/>
-  </w:num>
-  <w:num w:numId="16">
-    <w:abstractNumId w:val="0"/>
-  </w:num>
-  <w:num w:numId="17">
+  <w:num w:numId="45">
     <w:abstractNumId w:val="9"/>
   </w:num>
-  <w:num w:numId="18">
-    <w:abstractNumId w:val="11"/>
-  </w:num>
-  <w:num w:numId="19">
-    <w:abstractNumId w:val="10"/>
-  </w:num>
-  <w:num w:numId="20">
-    <w:abstractNumId w:val="2"/>
-  </w:num>
-  <w:num w:numId="21">
-    <w:abstractNumId w:val="19"/>
-  </w:num>
-  <w:num w:numId="22">
-    <w:abstractNumId w:val="14"/>
-  </w:num>
-  <w:num w:numId="23">
-    <w:abstractNumId w:val="13"/>
-  </w:num>
-  <w:num w:numId="24">
-    <w:abstractNumId w:val="0"/>
-  </w:num>
-  <w:num w:numId="25">
-    <w:abstractNumId w:val="1"/>
-  </w:num>
-  <w:num w:numId="26">
-    <w:abstractNumId w:val="9"/>
-  </w:num>
-  <w:num w:numId="27">
-    <w:abstractNumId w:val="6"/>
-  </w:num>
-  <w:num w:numId="28">
-    <w:abstractNumId w:val="2"/>
-  </w:num>
-  <w:num w:numId="29">
-    <w:abstractNumId w:val="19"/>
-  </w:num>
-  <w:num w:numId="30">
-    <w:abstractNumId w:val="11"/>
-  </w:num>
-  <w:num w:numId="31">
-    <w:abstractNumId w:val="14"/>
-  </w:num>
-  <w:num w:numId="32">
-    <w:abstractNumId w:val="13"/>
-  </w:num>
-  <w:num w:numId="33">
-    <w:abstractNumId w:val="0"/>
-  </w:num>
-  <w:num w:numId="34">
-    <w:abstractNumId w:val="11"/>
-  </w:num>
-  <w:num w:numId="35">
-    <w:abstractNumId w:val="11"/>
-  </w:num>
-  <w:num w:numId="36">
-    <w:abstractNumId w:val="1"/>
-  </w:num>
-  <w:num w:numId="37">
-    <w:abstractNumId w:val="9"/>
-  </w:num>
-  <w:num w:numId="38">
-    <w:abstractNumId w:val="6"/>
-  </w:num>
-  <w:num w:numId="39">
-    <w:abstractNumId w:val="12"/>
-  </w:num>
-  <w:num w:numId="40">
+  <w:num w:numId="46">
     <w:abstractNumId w:val="17"/>
   </w:num>
-  <w:num w:numId="41">
-    <w:abstractNumId w:val="18"/>
-  </w:num>
-  <w:num w:numId="42">
-    <w:abstractNumId w:val="7"/>
-  </w:num>
-  <w:num w:numId="43">
-    <w:abstractNumId w:val="3"/>
-  </w:num>
-  <w:num w:numId="44">
-    <w:abstractNumId w:val="4"/>
-  </w:num>
-  <w:num w:numId="45">
-    <w:abstractNumId w:val="8"/>
-  </w:num>
-  <w:num w:numId="46">
-    <w:abstractNumId w:val="16"/>
+  <w:num w:numId="47">
+    <w:abstractNumId w:val="0"/>
   </w:num>
 </w:numbering>
 </file>

</xml_diff>

<commit_message>
adjusting expect_after_motion_or_answer for type_of_response.all_false() Only gets Court will schedule a hearing.
</commit_message>
<xml_diff>
--- a/docassemble/AKA2JBranding/data/templates/expect_after_motion_or_answer_content.docx
+++ b/docassemble/AKA2JBranding/data/templates/expect_after_motion_or_answer_content.docx
@@ -65,7 +65,73 @@
         <w:rPr>
           <w:color w:val="FF0000"/>
         </w:rPr>
-        <w:t>{%p elif (user_need == 'answer custody' and type_of_response.all_true('ak custody case', exclusive = True)) or (user_need == 'answer divorce' and type_of_response.all_true('ak divorce case', exclusive = True)) or (type_of_response['case in 2 states'] and not type_of_response['default'] and stage_of_other_case == 'ended with no order') %}</w:t>
+        <w:t xml:space="preserve">{%p elif (user_need == 'answer custody' and type_of_response.all_true('ak custody case', exclusive = True)) or (user_need == 'answer divorce' and type_of_response.all_true('ak divorce case', exclusive = True)) or (type_of_response['case in 2 states'] and not type_of_response['default'] and stage_of_other_case == 'ended with no order') </w:t>
+      </w:r>
+      <w:r>
+        <w:rPr>
+          <w:color w:val="FF0000"/>
+        </w:rPr>
+        <w:t>or (</w:t>
+      </w:r>
+      <w:r>
+        <w:rPr>
+          <w:color w:val="FF0000"/>
+        </w:rPr>
+        <w:t xml:space="preserve">user_need </w:t>
+      </w:r>
+      <w:r>
+        <w:rPr>
+          <w:color w:val="FF0000"/>
+        </w:rPr>
+        <w:t>in</w:t>
+      </w:r>
+      <w:r>
+        <w:rPr>
+          <w:color w:val="FF0000"/>
+        </w:rPr>
+        <w:t xml:space="preserve"> </w:t>
+      </w:r>
+      <w:r>
+        <w:rPr>
+          <w:color w:val="FF0000"/>
+        </w:rPr>
+        <w:t>(</w:t>
+      </w:r>
+      <w:r>
+        <w:rPr>
+          <w:color w:val="FF0000"/>
+        </w:rPr>
+        <w:t>'answer custody'</w:t>
+      </w:r>
+      <w:r>
+        <w:rPr>
+          <w:color w:val="FF0000"/>
+        </w:rPr>
+        <w:t>,</w:t>
+      </w:r>
+      <w:r>
+        <w:rPr>
+          <w:color w:val="FF0000"/>
+        </w:rPr>
+        <w:t xml:space="preserve"> </w:t>
+      </w:r>
+      <w:r>
+        <w:rPr>
+          <w:color w:val="FF0000"/>
+        </w:rPr>
+        <w:t>'answer divorce'</w:t>
+      </w:r>
+      <w:r>
+        <w:rPr>
+          <w:color w:val="FF0000"/>
+        </w:rPr>
+        <w:t xml:space="preserve">) and type_of_response.all_false()) </w:t>
+      </w:r>
+      <w:r>
+        <w:rPr>
+          <w:color w:val="FF0000"/>
+        </w:rPr>
+        <w:t>%}</w:t>
       </w:r>
     </w:p>
     <w:p>
@@ -307,21 +373,7 @@
           <w:rStyle w:val="Hyperlink"/>
           <w:color w:val="FFC000"/>
         </w:rPr>
-        <w:t>{%</w:t>
-      </w:r>
-      <w:r>
-        <w:rPr>
-          <w:rStyle w:val="Hyperlink"/>
-          <w:color w:val="FFC000"/>
-        </w:rPr>
-        <w:t>p</w:t>
-      </w:r>
-      <w:r>
-        <w:rPr>
-          <w:rStyle w:val="Hyperlink"/>
-          <w:color w:val="FFC000"/>
-        </w:rPr>
-        <w:t xml:space="preserve"> endif %}</w:t>
+        <w:t>{%p endif %}</w:t>
       </w:r>
     </w:p>
     <w:p>
@@ -808,6 +860,7 @@
           <w:b/>
           <w:bCs/>
         </w:rPr>
+        <w:lastRenderedPageBreak/>
         <w:t>Property &amp; Debt Worksheet, SHC-1000</w:t>
       </w:r>
       <w:r>
@@ -1040,19 +1093,7 @@
           <w:rPr>
             <w:rStyle w:val="Hyperlink"/>
           </w:rPr>
-          <w:t xml:space="preserve">Fill </w:t>
-        </w:r>
-        <w:r>
-          <w:rPr>
-            <w:rStyle w:val="Hyperlink"/>
-          </w:rPr>
-          <w:t>i</w:t>
-        </w:r>
-        <w:r>
-          <w:rPr>
-            <w:rStyle w:val="Hyperlink"/>
-          </w:rPr>
-          <w:t>n PDF</w:t>
+          <w:t>Fill in PDF</w:t>
         </w:r>
       </w:hyperlink>
       <w:r>
@@ -1119,8 +1160,8 @@
           </w:rPr>
           <w:t>egoBeRFB_Uw</w:t>
         </w:r>
+        <w:proofErr w:type="spellEnd"/>
       </w:hyperlink>
-      <w:proofErr w:type="spellEnd"/>
     </w:p>
     <w:p>
       <w:pPr>
@@ -1177,19 +1218,7 @@
           <w:rPr>
             <w:rStyle w:val="Hyperlink"/>
           </w:rPr>
-          <w:t>How do I reply to a</w:t>
-        </w:r>
-        <w:r>
-          <w:rPr>
-            <w:rStyle w:val="Hyperlink"/>
-          </w:rPr>
-          <w:t>n</w:t>
-        </w:r>
-        <w:r>
-          <w:rPr>
-            <w:rStyle w:val="Hyperlink"/>
-          </w:rPr>
-          <w:t xml:space="preserve"> opposition?</w:t>
+          <w:t>How do I reply to an opposition?</w:t>
         </w:r>
       </w:hyperlink>
       <w:r>

</xml_diff>

<commit_message>
update motion to reconsider template, some ak-courts.info links wait to sign substitute with signing_paragraph
</commit_message>
<xml_diff>
--- a/docassemble/AKA2JBranding/data/templates/expect_after_motion_or_answer_content.docx
+++ b/docassemble/AKA2JBranding/data/templates/expect_after_motion_or_answer_content.docx
@@ -217,9 +217,63 @@
           <w:b/>
           <w:bCs/>
         </w:rPr>
-        <w:t xml:space="preserve">Civil Rule 26.1 Questionnaire, SHC-1010 </w:t>
+        <w:t xml:space="preserve">Civil Rule 26.1 Questionnaire, </w:t>
+      </w:r>
+      <w:r>
+        <w:rPr>
+          <w:b/>
+          <w:bCs/>
+        </w:rPr>
+        <w:t>DR</w:t>
+      </w:r>
+      <w:r>
+        <w:rPr>
+          <w:b/>
+          <w:bCs/>
+        </w:rPr>
+        <w:t>-</w:t>
+      </w:r>
+      <w:r>
+        <w:rPr>
+          <w:b/>
+          <w:bCs/>
+        </w:rPr>
+        <w:t>89</w:t>
+      </w:r>
+      <w:r>
+        <w:rPr>
+          <w:b/>
+          <w:bCs/>
+        </w:rPr>
+        <w:t xml:space="preserve">0 </w:t>
       </w:r>
       <w:hyperlink r:id="rId9" w:history="1">
+        <w:r>
+          <w:rPr>
+            <w:rStyle w:val="Hyperlink"/>
+          </w:rPr>
+          <w:t>Fill in PDF</w:t>
+        </w:r>
+      </w:hyperlink>
+    </w:p>
+    <w:p>
+      <w:pPr>
+        <w:pStyle w:val="Body"/>
+        <w:numPr>
+          <w:ilvl w:val="0"/>
+          <w:numId w:val="45"/>
+        </w:numPr>
+        <w:spacing w:before="54" w:beforeAutospacing="1" w:afterAutospacing="1"/>
+        <w:ind w:left="510"/>
+      </w:pPr>
+      <w:r>
+        <w:rPr>
+          <w:b/>
+          <w:bCs/>
+        </w:rPr>
+        <w:t xml:space="preserve">Property &amp; Debt Worksheet, SHC-1000 SHC-1000 </w:t>
+      </w:r>
+      <w:hyperlink r:id="rId10" w:history="1">
         <w:r>
           <w:rPr>
             <w:rStyle w:val="Hyperlink"/>
@@ -234,7 +288,7 @@
         </w:rPr>
         <w:t xml:space="preserve"> | </w:t>
       </w:r>
-      <w:hyperlink r:id="rId10" w:history="1">
+      <w:hyperlink r:id="rId11" w:history="1">
         <w:r>
           <w:rPr>
             <w:rStyle w:val="Hyperlink"/>
@@ -246,55 +300,14 @@
     <w:p>
       <w:pPr>
         <w:pStyle w:val="Body"/>
-        <w:numPr>
-          <w:ilvl w:val="0"/>
-          <w:numId w:val="45"/>
-        </w:numPr>
-        <w:spacing w:before="54" w:beforeAutospacing="1" w:afterAutospacing="1"/>
-        <w:ind w:left="510"/>
-      </w:pPr>
-      <w:r>
-        <w:rPr>
-          <w:b/>
-          <w:bCs/>
-        </w:rPr>
-        <w:t xml:space="preserve">Property &amp; Debt Worksheet, SHC-1000 SHC-1000 </w:t>
-      </w:r>
-      <w:hyperlink r:id="rId11" w:history="1">
-        <w:r>
-          <w:rPr>
-            <w:rStyle w:val="Hyperlink"/>
-          </w:rPr>
-          <w:t>Word</w:t>
-        </w:r>
-      </w:hyperlink>
-      <w:r>
-        <w:rPr>
-          <w:b/>
-          <w:bCs/>
-        </w:rPr>
-        <w:t xml:space="preserve"> | </w:t>
+        <w:rPr>
+          <w:rStyle w:val="Hyperlink"/>
+        </w:rPr>
+      </w:pPr>
+      <w:r>
+        <w:t xml:space="preserve">See the court's web page </w:t>
       </w:r>
       <w:hyperlink r:id="rId12" w:history="1">
-        <w:r>
-          <w:rPr>
-            <w:rStyle w:val="Hyperlink"/>
-          </w:rPr>
-          <w:t>PDF</w:t>
-        </w:r>
-      </w:hyperlink>
-    </w:p>
-    <w:p>
-      <w:pPr>
-        <w:pStyle w:val="Body"/>
-        <w:rPr>
-          <w:rStyle w:val="Hyperlink"/>
-        </w:rPr>
-      </w:pPr>
-      <w:r>
-        <w:t xml:space="preserve">See the court's web page </w:t>
-      </w:r>
-      <w:hyperlink r:id="rId13" w:history="1">
         <w:r>
           <w:rPr>
             <w:rStyle w:val="Hyperlink"/>
@@ -354,7 +367,7 @@
         </w:rPr>
         <w:t xml:space="preserve">Watch </w:t>
       </w:r>
-      <w:hyperlink r:id="rId14" w:history="1">
+      <w:hyperlink r:id="rId13" w:history="1">
         <w:r>
           <w:rPr>
             <w:rStyle w:val="Hyperlink"/>
@@ -464,7 +477,7 @@
       <w:r>
         <w:t xml:space="preserve"> [</w:t>
       </w:r>
-      <w:hyperlink r:id="rId15" w:history="1">
+      <w:hyperlink r:id="rId14" w:history="1">
         <w:r>
           <w:rPr>
             <w:rStyle w:val="Hyperlink"/>
@@ -500,7 +513,7 @@
         <w:spacing w:before="54" w:beforeAutospacing="1" w:afterAutospacing="1"/>
         <w:ind w:left="960"/>
       </w:pPr>
-      <w:hyperlink r:id="rId16" w:history="1">
+      <w:hyperlink r:id="rId15" w:history="1">
         <w:r>
           <w:rPr>
             <w:rStyle w:val="Hyperlink"/>
@@ -522,7 +535,7 @@
         <w:spacing w:before="54" w:beforeAutospacing="1" w:afterAutospacing="1"/>
         <w:ind w:left="960"/>
       </w:pPr>
-      <w:hyperlink r:id="rId17" w:history="1">
+      <w:hyperlink r:id="rId16" w:history="1">
         <w:r>
           <w:rPr>
             <w:rStyle w:val="Hyperlink"/>
@@ -558,7 +571,7 @@
         <w:spacing w:before="54" w:beforeAutospacing="1" w:afterAutospacing="1"/>
         <w:ind w:left="960"/>
       </w:pPr>
-      <w:hyperlink r:id="rId18" w:history="1">
+      <w:hyperlink r:id="rId17" w:history="1">
         <w:r>
           <w:rPr>
             <w:rStyle w:val="Hyperlink"/>
@@ -662,7 +675,7 @@
         <w:pStyle w:val="Body"/>
         <w:spacing w:before="54"/>
       </w:pPr>
-      <w:hyperlink r:id="rId19" w:history="1">
+      <w:hyperlink r:id="rId18" w:history="1">
         <w:r>
           <w:rPr>
             <w:rStyle w:val="Hyperlink"/>
@@ -673,7 +686,7 @@
       <w:r>
         <w:br/>
       </w:r>
-      <w:hyperlink r:id="rId20" w:history="1">
+      <w:hyperlink r:id="rId19" w:history="1">
         <w:r>
           <w:rPr>
             <w:rStyle w:val="Hyperlink"/>
@@ -741,19 +754,87 @@
           <w:b/>
           <w:bCs/>
         </w:rPr>
-        <w:t>Civil Rule 26.1 Questionnaire, SHC-1010</w:t>
+        <w:t xml:space="preserve">Civil Rule 26.1 Questionnaire, </w:t>
       </w:r>
       <w:r>
         <w:rPr>
           <w:b/>
           <w:bCs/>
         </w:rPr>
+        <w:t>DR</w:t>
+      </w:r>
+      <w:r>
+        <w:rPr>
+          <w:b/>
+          <w:bCs/>
+        </w:rPr>
+        <w:t>-</w:t>
+      </w:r>
+      <w:r>
+        <w:rPr>
+          <w:b/>
+          <w:bCs/>
+        </w:rPr>
+        <w:t>89</w:t>
+      </w:r>
+      <w:r>
+        <w:rPr>
+          <w:b/>
+          <w:bCs/>
+        </w:rPr>
+        <w:t>0</w:t>
+      </w:r>
+      <w:r>
+        <w:t xml:space="preserve"> [</w:t>
+      </w:r>
+      <w:hyperlink r:id="rId20" w:history="1">
+        <w:r>
+          <w:rPr>
+            <w:rStyle w:val="Hyperlink"/>
+          </w:rPr>
+          <w:t>Fill in PDF</w:t>
+        </w:r>
+      </w:hyperlink>
+      <w:r>
+        <w:rPr>
+          <w:rStyle w:val="Hyperlink"/>
+          <w:color w:val="auto"/>
+        </w:rPr>
+        <w:t>]</w:t>
+      </w:r>
+      <w:r>
+        <w:rPr>
+          <w:rStyle w:val="Hyperlink"/>
+        </w:rPr>
         <w:br/>
       </w:r>
-      <w:r>
+      <w:hyperlink r:id="rId21" w:history="1">
+        <w:r>
+          <w:rPr>
+            <w:rStyle w:val="Hyperlink"/>
+            <w:spacing w:val="0"/>
+          </w:rPr>
+          <w:t>ak-courts.info/dr890</w:t>
+        </w:r>
+      </w:hyperlink>
+    </w:p>
+    <w:p>
+      <w:pPr>
+        <w:pStyle w:val="Body"/>
+        <w:spacing w:before="54" w:beforeAutospacing="1" w:afterAutospacing="1"/>
+      </w:pPr>
+      <w:r>
+        <w:rPr>
+          <w:b/>
+          <w:bCs/>
+        </w:rPr>
+        <w:t>Property &amp; Debt Worksheet, SHC-1000</w:t>
+      </w:r>
+      <w:r>
+        <w:br/>
         <w:t xml:space="preserve">as a </w:t>
       </w:r>
-      <w:hyperlink r:id="rId21" w:history="1">
+      <w:hyperlink r:id="rId22" w:history="1">
         <w:r>
           <w:rPr>
             <w:rStyle w:val="Hyperlink"/>
@@ -762,10 +843,6 @@
         </w:r>
       </w:hyperlink>
       <w:r>
-        <w:rPr>
-          <w:b/>
-          <w:bCs/>
-        </w:rPr>
         <w:t xml:space="preserve"> </w:t>
       </w:r>
       <w:r>
@@ -774,43 +851,20 @@
       <w:r>
         <w:br/>
       </w:r>
-      <w:hyperlink r:id="rId22" w:history="1">
+      <w:hyperlink r:id="rId23" w:history="1">
         <w:r>
           <w:rPr>
             <w:rStyle w:val="Hyperlink"/>
             <w:spacing w:val="0"/>
           </w:rPr>
-          <w:t>courts.alaska.gov/</w:t>
-        </w:r>
-        <w:proofErr w:type="spellStart"/>
-        <w:r>
-          <w:rPr>
-            <w:rStyle w:val="Hyperlink"/>
-            <w:spacing w:val="0"/>
-          </w:rPr>
-          <w:t>shc</w:t>
-        </w:r>
-        <w:proofErr w:type="spellEnd"/>
-        <w:r>
-          <w:rPr>
-            <w:rStyle w:val="Hyperlink"/>
-            <w:spacing w:val="0"/>
-          </w:rPr>
-          <w:t>/family/docs/shc-1010.doc</w:t>
+          <w:t>courts.alaska.gov/shc/family/docs/shc-1000.doc</w:t>
         </w:r>
       </w:hyperlink>
       <w:r>
         <w:br/>
-        <w:t>as a</w:t>
-      </w:r>
-      <w:r>
-        <w:rPr>
-          <w:b/>
-          <w:bCs/>
-        </w:rPr>
-        <w:t xml:space="preserve"> </w:t>
-      </w:r>
-      <w:hyperlink r:id="rId23" w:history="1">
+        <w:t xml:space="preserve">as a </w:t>
+      </w:r>
+      <w:hyperlink r:id="rId24" w:history="1">
         <w:r>
           <w:rPr>
             <w:rStyle w:val="Hyperlink"/>
@@ -824,143 +878,24 @@
         </w:rPr>
         <w:br/>
       </w:r>
-      <w:hyperlink r:id="rId24" w:history="1">
+      <w:hyperlink r:id="rId25" w:history="1">
         <w:r>
           <w:rPr>
             <w:rStyle w:val="Hyperlink"/>
             <w:spacing w:val="0"/>
           </w:rPr>
-          <w:t>courts.alaska.gov/</w:t>
-        </w:r>
-        <w:proofErr w:type="spellStart"/>
-        <w:r>
-          <w:rPr>
-            <w:rStyle w:val="Hyperlink"/>
-            <w:spacing w:val="0"/>
-          </w:rPr>
-          <w:t>shc</w:t>
-        </w:r>
-        <w:proofErr w:type="spellEnd"/>
-        <w:r>
-          <w:rPr>
-            <w:rStyle w:val="Hyperlink"/>
-            <w:spacing w:val="0"/>
-          </w:rPr>
-          <w:t>/family/docs/shc-1010n.pdf</w:t>
+          <w:t>courts.alaska.gov/shc/family/docs/shc-1000n.pdf</w:t>
         </w:r>
       </w:hyperlink>
     </w:p>
     <w:p>
       <w:pPr>
         <w:pStyle w:val="Body"/>
-        <w:spacing w:before="54" w:beforeAutospacing="1" w:afterAutospacing="1"/>
-      </w:pPr>
-      <w:r>
-        <w:rPr>
-          <w:b/>
-          <w:bCs/>
-        </w:rPr>
-        <w:lastRenderedPageBreak/>
-        <w:t>Property &amp; Debt Worksheet, SHC-1000</w:t>
-      </w:r>
-      <w:r>
-        <w:br/>
-        <w:t xml:space="preserve">as a </w:t>
-      </w:r>
-      <w:hyperlink r:id="rId25" w:history="1">
-        <w:r>
-          <w:rPr>
-            <w:rStyle w:val="Hyperlink"/>
-          </w:rPr>
-          <w:t>Word</w:t>
-        </w:r>
-      </w:hyperlink>
-      <w:r>
-        <w:t xml:space="preserve"> </w:t>
-      </w:r>
-      <w:r>
-        <w:t>file</w:t>
-      </w:r>
-      <w:r>
-        <w:br/>
-      </w:r>
+        <w:rPr>
+          <w:rStyle w:val="Hyperlink"/>
+        </w:rPr>
+      </w:pPr>
       <w:hyperlink r:id="rId26" w:history="1">
-        <w:r>
-          <w:rPr>
-            <w:rStyle w:val="Hyperlink"/>
-            <w:spacing w:val="0"/>
-          </w:rPr>
-          <w:t>courts.alaska.gov/</w:t>
-        </w:r>
-        <w:proofErr w:type="spellStart"/>
-        <w:r>
-          <w:rPr>
-            <w:rStyle w:val="Hyperlink"/>
-            <w:spacing w:val="0"/>
-          </w:rPr>
-          <w:t>shc</w:t>
-        </w:r>
-        <w:proofErr w:type="spellEnd"/>
-        <w:r>
-          <w:rPr>
-            <w:rStyle w:val="Hyperlink"/>
-            <w:spacing w:val="0"/>
-          </w:rPr>
-          <w:t>/family/docs/shc-1000.doc</w:t>
-        </w:r>
-      </w:hyperlink>
-      <w:r>
-        <w:br/>
-        <w:t xml:space="preserve">as a </w:t>
-      </w:r>
-      <w:hyperlink r:id="rId27" w:history="1">
-        <w:r>
-          <w:rPr>
-            <w:rStyle w:val="Hyperlink"/>
-          </w:rPr>
-          <w:t>PDF</w:t>
-        </w:r>
-      </w:hyperlink>
-      <w:r>
-        <w:rPr>
-          <w:rStyle w:val="Hyperlink"/>
-        </w:rPr>
-        <w:br/>
-      </w:r>
-      <w:hyperlink r:id="rId28" w:history="1">
-        <w:r>
-          <w:rPr>
-            <w:rStyle w:val="Hyperlink"/>
-            <w:spacing w:val="0"/>
-          </w:rPr>
-          <w:t>courts.alaska.gov/</w:t>
-        </w:r>
-        <w:proofErr w:type="spellStart"/>
-        <w:r>
-          <w:rPr>
-            <w:rStyle w:val="Hyperlink"/>
-            <w:spacing w:val="0"/>
-          </w:rPr>
-          <w:t>shc</w:t>
-        </w:r>
-        <w:proofErr w:type="spellEnd"/>
-        <w:r>
-          <w:rPr>
-            <w:rStyle w:val="Hyperlink"/>
-            <w:spacing w:val="0"/>
-          </w:rPr>
-          <w:t>/family/docs/shc-1000n.pdf</w:t>
-        </w:r>
-      </w:hyperlink>
-    </w:p>
-    <w:p>
-      <w:pPr>
-        <w:pStyle w:val="Body"/>
-        <w:rPr>
-          <w:rStyle w:val="Hyperlink"/>
-        </w:rPr>
-      </w:pPr>
-      <w:hyperlink r:id="rId29" w:history="1">
         <w:r>
           <w:rPr>
             <w:rStyle w:val="Hyperlink"/>
@@ -1010,7 +945,7 @@
         </w:rPr>
         <w:br/>
       </w:r>
-      <w:hyperlink r:id="rId30" w:history="1">
+      <w:hyperlink r:id="rId27" w:history="1">
         <w:r>
           <w:rPr>
             <w:rStyle w:val="Hyperlink"/>
@@ -1028,7 +963,7 @@
           <w:color w:val="auto"/>
         </w:rPr>
       </w:pPr>
-      <w:hyperlink r:id="rId31" w:history="1">
+      <w:hyperlink r:id="rId28" w:history="1">
         <w:r>
           <w:rPr>
             <w:rStyle w:val="Hyperlink"/>
@@ -1088,7 +1023,7 @@
       <w:r>
         <w:t xml:space="preserve"> [</w:t>
       </w:r>
-      <w:hyperlink r:id="rId32" w:history="1">
+      <w:hyperlink r:id="rId29" w:history="1">
         <w:r>
           <w:rPr>
             <w:rStyle w:val="Hyperlink"/>
@@ -1102,7 +1037,7 @@
       <w:r>
         <w:br/>
       </w:r>
-      <w:hyperlink r:id="rId33" w:history="1">
+      <w:hyperlink r:id="rId30" w:history="1">
         <w:r>
           <w:rPr>
             <w:rStyle w:val="Hyperlink"/>
@@ -1117,7 +1052,7 @@
         <w:pStyle w:val="Body"/>
         <w:spacing w:before="54" w:beforeAutospacing="1" w:afterAutospacing="1"/>
       </w:pPr>
-      <w:hyperlink r:id="rId34" w:history="1">
+      <w:hyperlink r:id="rId31" w:history="1">
         <w:r>
           <w:rPr>
             <w:rStyle w:val="Hyperlink"/>
@@ -1128,7 +1063,7 @@
       <w:r>
         <w:br/>
       </w:r>
-      <w:hyperlink r:id="rId35" w:history="1">
+      <w:hyperlink r:id="rId32" w:history="1">
         <w:r>
           <w:rPr>
             <w:rStyle w:val="Hyperlink"/>
@@ -1168,7 +1103,7 @@
         <w:pStyle w:val="Body"/>
         <w:spacing w:before="54" w:beforeAutospacing="1" w:afterAutospacing="1"/>
       </w:pPr>
-      <w:hyperlink r:id="rId36" w:history="1">
+      <w:hyperlink r:id="rId33" w:history="1">
         <w:r>
           <w:rPr>
             <w:rStyle w:val="Hyperlink"/>
@@ -1182,7 +1117,7 @@
         </w:rPr>
         <w:br/>
       </w:r>
-      <w:hyperlink r:id="rId37" w:history="1">
+      <w:hyperlink r:id="rId34" w:history="1">
         <w:r>
           <w:rPr>
             <w:rStyle w:val="Hyperlink"/>
@@ -1213,7 +1148,7 @@
         <w:pStyle w:val="Body"/>
         <w:spacing w:before="54" w:beforeAutospacing="1" w:afterAutospacing="1"/>
       </w:pPr>
-      <w:hyperlink r:id="rId38" w:history="1">
+      <w:hyperlink r:id="rId35" w:history="1">
         <w:r>
           <w:rPr>
             <w:rStyle w:val="Hyperlink"/>
@@ -1228,7 +1163,7 @@
         </w:rPr>
         <w:br/>
       </w:r>
-      <w:hyperlink r:id="rId39" w:history="1">
+      <w:hyperlink r:id="rId36" w:history="1">
         <w:r>
           <w:rPr>
             <w:rStyle w:val="Hyperlink"/>
@@ -1259,12 +1194,12 @@
       </w:r>
     </w:p>
     <w:sectPr>
-      <w:headerReference w:type="even" r:id="rId40"/>
-      <w:headerReference w:type="default" r:id="rId41"/>
-      <w:footerReference w:type="even" r:id="rId42"/>
-      <w:footerReference w:type="default" r:id="rId43"/>
-      <w:headerReference w:type="first" r:id="rId44"/>
-      <w:footerReference w:type="first" r:id="rId45"/>
+      <w:headerReference w:type="even" r:id="rId37"/>
+      <w:headerReference w:type="default" r:id="rId38"/>
+      <w:footerReference w:type="even" r:id="rId39"/>
+      <w:footerReference w:type="default" r:id="rId40"/>
+      <w:headerReference w:type="first" r:id="rId41"/>
+      <w:footerReference w:type="first" r:id="rId42"/>
       <w:pgSz w:w="12240" w:h="15840"/>
       <w:pgMar w:top="1440" w:right="1440" w:bottom="1440" w:left="1440" w:header="720" w:footer="720" w:gutter="0"/>
       <w:cols w:space="720"/>

</xml_diff>